<commit_message>
freies Zeitfenster +7 gelöscht
</commit_message>
<xml_diff>
--- a/Deadline_map.docx
+++ b/Deadline_map.docx
@@ -1514,11 +1514,1664 @@
       </w:r>
     </w:p>
     <w:p/>
+    <w:p>
+      <w:pPr>
+        <w:rPr>
+          <w:b/>
+          <w:bCs/>
+        </w:rPr>
+      </w:pPr>
+      <w:r>
+        <w:rPr>
+          <w:b/>
+          <w:bCs/>
+        </w:rPr>
+        <w:t>1. Optische Verbesserungen &amp; Blockansicht</w:t>
+      </w:r>
+    </w:p>
+    <w:p>
+      <w:pPr>
+        <w:numPr>
+          <w:ilvl w:val="0"/>
+          <w:numId w:val="15"/>
+        </w:numPr>
+      </w:pPr>
+      <w:r>
+        <w:rPr>
+          <w:b/>
+          <w:bCs/>
+        </w:rPr>
+        <w:t>Story – Visuelle Hierarchie:</w:t>
+      </w:r>
+      <w:r>
+        <w:t xml:space="preserve"> Als Nutzer möchte ich, dass Aufgaben mit hoher Priorität farblich hervorgehoben werden, damit ich sofort sehe, worauf mein Fokus liegen muss.</w:t>
+      </w:r>
+    </w:p>
+    <w:p>
+      <w:pPr>
+        <w:numPr>
+          <w:ilvl w:val="0"/>
+          <w:numId w:val="15"/>
+        </w:numPr>
+      </w:pPr>
+      <w:r>
+        <w:rPr>
+          <w:b/>
+          <w:bCs/>
+        </w:rPr>
+        <w:t>Story – Fortschrittsbalken:</w:t>
+      </w:r>
+      <w:r>
+        <w:t xml:space="preserve"> Als Nutzer möchte ich einen Fortschrittsbalken für jede Aufgabe sehen (z. B. "3 von 10 Stunden geplant"), um zu verstehen, wie viel Aufwand noch verteilt werden muss.</w:t>
+      </w:r>
+    </w:p>
+    <w:p>
+      <w:pPr>
+        <w:numPr>
+          <w:ilvl w:val="0"/>
+          <w:numId w:val="15"/>
+        </w:numPr>
+      </w:pPr>
+      <w:r>
+        <w:rPr>
+          <w:b/>
+          <w:bCs/>
+        </w:rPr>
+        <w:t>Story – Zeit-Blöcke:</w:t>
+      </w:r>
+      <w:r>
+        <w:t xml:space="preserve"> Als Nutzer möchte ich, dass die Tagesansicht in "Blöcken" dargestellt wird, deren Höhe proportional zur Zeitdauer ist, um ein besseres Gefühl für die Tageslast zu bekommen.</w:t>
+      </w:r>
+    </w:p>
+    <w:p>
+      <w:pPr>
+        <w:numPr>
+          <w:ilvl w:val="0"/>
+          <w:numId w:val="15"/>
+        </w:numPr>
+      </w:pPr>
+      <w:r>
+        <w:rPr>
+          <w:b/>
+          <w:bCs/>
+        </w:rPr>
+        <w:t>Story – Dark Mode / Modern UI:</w:t>
+      </w:r>
+      <w:r>
+        <w:t xml:space="preserve"> Als Nutzer möchte ich ein modernes Interface mit abgerundeten Karten und subtilen Schatten, damit das Planen weniger nach "Arbeit" aussieht.</w:t>
+      </w:r>
+    </w:p>
+    <w:p>
+      <w:r>
+        <w:pict w14:anchorId="31D0F25B">
+          <v:rect id="_x0000_i1050" style="width:0;height:1.5pt" o:hralign="center" o:hrstd="t" o:hrnoshade="t" o:hr="t" fillcolor="gray" stroked="f"/>
+        </w:pict>
+      </w:r>
+    </w:p>
+    <w:p>
+      <w:pPr>
+        <w:rPr>
+          <w:b/>
+          <w:bCs/>
+        </w:rPr>
+      </w:pPr>
+      <w:r>
+        <w:rPr>
+          <w:b/>
+          <w:bCs/>
+        </w:rPr>
+        <w:t>2. Kalenderansicht</w:t>
+      </w:r>
+    </w:p>
+    <w:p>
+      <w:pPr>
+        <w:numPr>
+          <w:ilvl w:val="0"/>
+          <w:numId w:val="16"/>
+        </w:numPr>
+      </w:pPr>
+      <w:r>
+        <w:rPr>
+          <w:b/>
+          <w:bCs/>
+        </w:rPr>
+        <w:t>Story – Monats-/Wochenübersicht:</w:t>
+      </w:r>
+      <w:r>
+        <w:t xml:space="preserve"> Als Nutzer möchte ich zwischen einer Listenansicht und einer klassischen Kalenderansicht (Gitter) umschalten können, um Deadlines im zeitlichen Kontext des gesamten Monats zu sehen.</w:t>
+      </w:r>
+    </w:p>
+    <w:p>
+      <w:pPr>
+        <w:numPr>
+          <w:ilvl w:val="0"/>
+          <w:numId w:val="16"/>
+        </w:numPr>
+      </w:pPr>
+      <w:r>
+        <w:rPr>
+          <w:b/>
+          <w:bCs/>
+        </w:rPr>
+        <w:t>Story – Drag &amp; Drop:</w:t>
+      </w:r>
+      <w:r>
+        <w:t xml:space="preserve"> Als Nutzer möchte ich geplante Lernblöcke im Kalender per Drag &amp; Drop auf einen anderen Tag verschieben können, wobei die Kapazitätsprüfung automatisch im Hintergrund aktualisiert wird.</w:t>
+      </w:r>
+    </w:p>
+    <w:p>
+      <w:pPr>
+        <w:numPr>
+          <w:ilvl w:val="0"/>
+          <w:numId w:val="16"/>
+        </w:numPr>
+      </w:pPr>
+      <w:r>
+        <w:rPr>
+          <w:b/>
+          <w:bCs/>
+        </w:rPr>
+        <w:t>Story – Deadline-Marker:</w:t>
+      </w:r>
+      <w:r>
+        <w:t xml:space="preserve"> Als Nutzer möchte ich Deadlines als markante "Zielflaggen" im Kalender sehen, um den zeitlichen Abstand zwischen heute und der Abgabe visuell zu messen.</w:t>
+      </w:r>
+    </w:p>
+    <w:p>
+      <w:r>
+        <w:pict w14:anchorId="37EE6D7E">
+          <v:rect id="_x0000_i1051" style="width:0;height:1.5pt" o:hralign="center" o:hrstd="t" o:hrnoshade="t" o:hr="t" fillcolor="gray" stroked="f"/>
+        </w:pict>
+      </w:r>
+    </w:p>
+    <w:p>
+      <w:pPr>
+        <w:rPr>
+          <w:b/>
+          <w:bCs/>
+        </w:rPr>
+      </w:pPr>
+      <w:r>
+        <w:rPr>
+          <w:b/>
+          <w:bCs/>
+        </w:rPr>
+        <w:lastRenderedPageBreak/>
+        <w:t>3. Freie Zeitfenster anzeigen</w:t>
+      </w:r>
+    </w:p>
+    <w:p>
+      <w:pPr>
+        <w:numPr>
+          <w:ilvl w:val="0"/>
+          <w:numId w:val="17"/>
+        </w:numPr>
+      </w:pPr>
+      <w:r>
+        <w:rPr>
+          <w:b/>
+          <w:bCs/>
+        </w:rPr>
+        <w:t>Story – Kapazitäts-</w:t>
+      </w:r>
+      <w:proofErr w:type="spellStart"/>
+      <w:r>
+        <w:rPr>
+          <w:b/>
+          <w:bCs/>
+        </w:rPr>
+        <w:t>Heatmap</w:t>
+      </w:r>
+      <w:proofErr w:type="spellEnd"/>
+      <w:r>
+        <w:rPr>
+          <w:b/>
+          <w:bCs/>
+        </w:rPr>
+        <w:t>:</w:t>
+      </w:r>
+      <w:r>
+        <w:t xml:space="preserve"> Als Nutzer möchte ich im Kalender sehen, an welchen Tagen ich noch freie Kapazitäten habe (z. B. grün für viel Platz, rot für voll belegt), um neue Aufgaben besser einplanen zu können.</w:t>
+      </w:r>
+    </w:p>
+    <w:p>
+      <w:pPr>
+        <w:numPr>
+          <w:ilvl w:val="0"/>
+          <w:numId w:val="17"/>
+        </w:numPr>
+      </w:pPr>
+      <w:r>
+        <w:rPr>
+          <w:b/>
+          <w:bCs/>
+        </w:rPr>
+        <w:t>Story – "Lücken"-Finder:</w:t>
+      </w:r>
+      <w:r>
+        <w:t xml:space="preserve"> Als Nutzer möchte ich eine Anzeige für "ungenutzte Zeit" erhalten, damit ich spontane Aufgaben in diese freien Slots schieben kann.</w:t>
+      </w:r>
+    </w:p>
+    <w:p>
+      <w:pPr>
+        <w:numPr>
+          <w:ilvl w:val="0"/>
+          <w:numId w:val="17"/>
+        </w:numPr>
+      </w:pPr>
+      <w:r>
+        <w:rPr>
+          <w:b/>
+          <w:bCs/>
+        </w:rPr>
+        <w:t>Story – Überlastungswarnung:</w:t>
+      </w:r>
+      <w:r>
+        <w:t xml:space="preserve"> Als Nutzer möchte ich eine visuelle Warnung erhalten, wenn ein Tag zu mehr als 100% verplant ist, damit ich die Planung sofort korrigieren kann.</w:t>
+      </w:r>
+    </w:p>
+    <w:p>
+      <w:r>
+        <w:pict w14:anchorId="50EB4BD8">
+          <v:rect id="_x0000_i1052" style="width:0;height:1.5pt" o:hralign="center" o:hrstd="t" o:hrnoshade="t" o:hr="t" fillcolor="gray" stroked="f"/>
+        </w:pict>
+      </w:r>
+    </w:p>
+    <w:p>
+      <w:pPr>
+        <w:rPr>
+          <w:b/>
+          <w:bCs/>
+        </w:rPr>
+      </w:pPr>
+      <w:r>
+        <w:rPr>
+          <w:b/>
+          <w:bCs/>
+        </w:rPr>
+        <w:t>Vorschlag zur technischen Umsetzung (UI-Struktur)</w:t>
+      </w:r>
+    </w:p>
+    <w:p>
+      <w:r>
+        <w:t xml:space="preserve">Um das in deinem Code umzusetzen, könntest du eine Bibliothek wie </w:t>
+      </w:r>
+      <w:proofErr w:type="spellStart"/>
+      <w:r>
+        <w:rPr>
+          <w:b/>
+          <w:bCs/>
+        </w:rPr>
+        <w:t>FullCalendar</w:t>
+      </w:r>
+      <w:proofErr w:type="spellEnd"/>
+      <w:r>
+        <w:t xml:space="preserve"> (für den Kalender) oder ein einfaches CSS-</w:t>
+      </w:r>
+      <w:proofErr w:type="spellStart"/>
+      <w:r>
+        <w:t>Grid</w:t>
+      </w:r>
+      <w:proofErr w:type="spellEnd"/>
+      <w:r>
+        <w:t xml:space="preserve"> für die Blockansicht nutzen. Hier ein Beispiel, wie eine </w:t>
+      </w:r>
+      <w:r>
+        <w:rPr>
+          <w:b/>
+          <w:bCs/>
+        </w:rPr>
+        <w:t>Blockansicht</w:t>
+      </w:r>
+      <w:r>
+        <w:t xml:space="preserve"> strukturell gedacht wäre</w:t>
+      </w:r>
+    </w:p>
     <w:p/>
-    <w:p>
-      <w:pPr>
-        <w:ind w:left="720"/>
-      </w:pPr>
+    <w:p/>
+    <w:p>
+      <w:r>
+        <w:t>Weitere Aufgaben</w:t>
+      </w:r>
+    </w:p>
+    <w:p>
+      <w:r>
+        <w:t xml:space="preserve">Das ist eine klassische Anforderung für die Unterscheidung zwischen </w:t>
+      </w:r>
+      <w:r>
+        <w:rPr>
+          <w:b/>
+          <w:bCs/>
+        </w:rPr>
+        <w:t>Standard-Verfügbarkeit</w:t>
+      </w:r>
+      <w:r>
+        <w:t xml:space="preserve"> (immer gültig) und </w:t>
+      </w:r>
+      <w:r>
+        <w:rPr>
+          <w:b/>
+          <w:bCs/>
+        </w:rPr>
+        <w:t>spezifischen Wochenplänen</w:t>
+      </w:r>
+      <w:r>
+        <w:t xml:space="preserve"> (Ausnahmen).</w:t>
+      </w:r>
+    </w:p>
+    <w:p>
+      <w:r>
+        <w:t>Hier sind die User Stories, die dieses flexible Kapazitäts-Modell beschreiben:</w:t>
+      </w:r>
+    </w:p>
+    <w:p>
+      <w:r>
+        <w:pict w14:anchorId="4FCD5480">
+          <v:rect id="_x0000_i1088" style="width:0;height:1.5pt" o:hralign="center" o:hrstd="t" o:hrnoshade="t" o:hr="t" fillcolor="gray" stroked="f"/>
+        </w:pict>
+      </w:r>
+    </w:p>
+    <w:p>
+      <w:pPr>
+        <w:rPr>
+          <w:b/>
+          <w:bCs/>
+        </w:rPr>
+      </w:pPr>
+      <w:r>
+        <w:rPr>
+          <w:b/>
+          <w:bCs/>
+        </w:rPr>
+        <w:t>1. Standard-Kapazität (Dauerhaft)</w:t>
+      </w:r>
+    </w:p>
+    <w:p>
+      <w:r>
+        <w:rPr>
+          <w:i/>
+          <w:iCs/>
+        </w:rPr>
+        <w:t>Fokus: Die Basis-Einstellung, damit der Nutzer nicht jedes Mal von vorn anfangen muss.</w:t>
+      </w:r>
+    </w:p>
+    <w:p>
+      <w:pPr>
+        <w:numPr>
+          <w:ilvl w:val="0"/>
+          <w:numId w:val="18"/>
+        </w:numPr>
+      </w:pPr>
+      <w:r>
+        <w:rPr>
+          <w:b/>
+          <w:bCs/>
+        </w:rPr>
+        <w:t>Story:</w:t>
+      </w:r>
+      <w:r>
+        <w:t xml:space="preserve"> Als Nutzer möchte ich wöchentliche </w:t>
+      </w:r>
+      <w:r>
+        <w:rPr>
+          <w:b/>
+          <w:bCs/>
+        </w:rPr>
+        <w:t>Standard-Zeitfenster</w:t>
+      </w:r>
+      <w:r>
+        <w:t xml:space="preserve"> definieren können (z. B. jeden Montag 2h), die automatisch für alle zukünftigen Wochen übernommen werden, damit ich eine Grundplanung ohne manuellen Aufwand habe.</w:t>
+      </w:r>
+    </w:p>
+    <w:p>
+      <w:pPr>
+        <w:numPr>
+          <w:ilvl w:val="0"/>
+          <w:numId w:val="18"/>
+        </w:numPr>
+      </w:pPr>
+      <w:r>
+        <w:rPr>
+          <w:b/>
+          <w:bCs/>
+        </w:rPr>
+        <w:t>Akzeptanzkriterien:</w:t>
+      </w:r>
+    </w:p>
+    <w:p>
+      <w:pPr>
+        <w:numPr>
+          <w:ilvl w:val="1"/>
+          <w:numId w:val="18"/>
+        </w:numPr>
+      </w:pPr>
+      <w:r>
+        <w:t>Es gibt einen Bereich "Standard-Woche".</w:t>
+      </w:r>
+    </w:p>
+    <w:p>
+      <w:pPr>
+        <w:numPr>
+          <w:ilvl w:val="1"/>
+          <w:numId w:val="18"/>
+        </w:numPr>
+      </w:pPr>
+      <w:r>
+        <w:t>Eingaben dort gelten unbegrenzt für die Zukunft.</w:t>
+      </w:r>
+    </w:p>
+    <w:p>
+      <w:pPr>
+        <w:numPr>
+          <w:ilvl w:val="1"/>
+          <w:numId w:val="18"/>
+        </w:numPr>
+      </w:pPr>
+      <w:r>
+        <w:t>Das System nutzt diese Werte als "</w:t>
+      </w:r>
+      <w:proofErr w:type="spellStart"/>
+      <w:r>
+        <w:t>Fallback</w:t>
+      </w:r>
+      <w:proofErr w:type="spellEnd"/>
+      <w:r>
+        <w:t>", wenn für eine spezifische Woche nichts anderes definiert wurde.</w:t>
+      </w:r>
+    </w:p>
+    <w:p>
+      <w:r>
+        <w:lastRenderedPageBreak/>
+        <w:pict w14:anchorId="132FA212">
+          <v:rect id="_x0000_i1089" style="width:0;height:1.5pt" o:hralign="center" o:hrstd="t" o:hrnoshade="t" o:hr="t" fillcolor="gray" stroked="f"/>
+        </w:pict>
+      </w:r>
+    </w:p>
+    <w:p>
+      <w:pPr>
+        <w:rPr>
+          <w:b/>
+          <w:bCs/>
+        </w:rPr>
+      </w:pPr>
+      <w:r>
+        <w:rPr>
+          <w:b/>
+          <w:bCs/>
+        </w:rPr>
+        <w:t>2. Wochen-Spezifische Anpassung</w:t>
+      </w:r>
+    </w:p>
+    <w:p>
+      <w:r>
+        <w:rPr>
+          <w:i/>
+          <w:iCs/>
+        </w:rPr>
+        <w:t>Fokus: Flexibilität für Klausurenphasen oder Urlaub.</w:t>
+      </w:r>
+    </w:p>
+    <w:p>
+      <w:pPr>
+        <w:numPr>
+          <w:ilvl w:val="0"/>
+          <w:numId w:val="19"/>
+        </w:numPr>
+      </w:pPr>
+      <w:r>
+        <w:rPr>
+          <w:b/>
+          <w:bCs/>
+        </w:rPr>
+        <w:t>Story:</w:t>
+      </w:r>
+      <w:r>
+        <w:t xml:space="preserve"> Als Nutzer möchte ich für eine </w:t>
+      </w:r>
+      <w:r>
+        <w:rPr>
+          <w:b/>
+          <w:bCs/>
+        </w:rPr>
+        <w:t>bestimmte Kalenderwoche</w:t>
+      </w:r>
+      <w:r>
+        <w:t xml:space="preserve"> von meinem Standard-Plan abweichen können, um auf kurzfristige Termine zu reagieren, ohne meinen generellen Rhythmus dauerhaft löschen zu müssen.</w:t>
+      </w:r>
+    </w:p>
+    <w:p>
+      <w:pPr>
+        <w:numPr>
+          <w:ilvl w:val="0"/>
+          <w:numId w:val="19"/>
+        </w:numPr>
+      </w:pPr>
+      <w:r>
+        <w:rPr>
+          <w:b/>
+          <w:bCs/>
+        </w:rPr>
+        <w:t>Akzeptanzkriterien:</w:t>
+      </w:r>
+    </w:p>
+    <w:p>
+      <w:pPr>
+        <w:numPr>
+          <w:ilvl w:val="1"/>
+          <w:numId w:val="19"/>
+        </w:numPr>
+      </w:pPr>
+      <w:r>
+        <w:t>Ich kann eine spezifische Woche (z. B. KW 22) auswählen.</w:t>
+      </w:r>
+    </w:p>
+    <w:p>
+      <w:pPr>
+        <w:numPr>
+          <w:ilvl w:val="1"/>
+          <w:numId w:val="19"/>
+        </w:numPr>
+      </w:pPr>
+      <w:r>
+        <w:t>Änderungen in dieser Woche überschreiben die Standard-Werte nur für diesen Zeitraum.</w:t>
+      </w:r>
+    </w:p>
+    <w:p>
+      <w:pPr>
+        <w:numPr>
+          <w:ilvl w:val="1"/>
+          <w:numId w:val="19"/>
+        </w:numPr>
+      </w:pPr>
+      <w:r>
+        <w:t>Nach Ablauf der Woche kehrt das System automatisch zum Standard-Plan zurück.</w:t>
+      </w:r>
+    </w:p>
+    <w:p>
+      <w:r>
+        <w:pict w14:anchorId="256951C6">
+          <v:rect id="_x0000_i1090" style="width:0;height:1.5pt" o:hralign="center" o:hrstd="t" o:hrnoshade="t" o:hr="t" fillcolor="gray" stroked="f"/>
+        </w:pict>
+      </w:r>
+    </w:p>
+    <w:p>
+      <w:pPr>
+        <w:rPr>
+          <w:b/>
+          <w:bCs/>
+        </w:rPr>
+      </w:pPr>
+      <w:r>
+        <w:rPr>
+          <w:b/>
+          <w:bCs/>
+        </w:rPr>
+        <w:t>3. "Dauerhaft übernehmen"-Funktion</w:t>
+      </w:r>
+    </w:p>
+    <w:p>
+      <w:r>
+        <w:rPr>
+          <w:i/>
+          <w:iCs/>
+        </w:rPr>
+        <w:t>Fokus: Den Übergang von einer Ausnahme zur neuen Regel.</w:t>
+      </w:r>
+    </w:p>
+    <w:p>
+      <w:pPr>
+        <w:numPr>
+          <w:ilvl w:val="0"/>
+          <w:numId w:val="20"/>
+        </w:numPr>
+      </w:pPr>
+      <w:r>
+        <w:rPr>
+          <w:b/>
+          <w:bCs/>
+        </w:rPr>
+        <w:t>Story:</w:t>
+      </w:r>
+      <w:r>
+        <w:t xml:space="preserve"> Als Nutzer möchte ich eine manuell angepasste Woche als </w:t>
+      </w:r>
+      <w:r>
+        <w:rPr>
+          <w:b/>
+          <w:bCs/>
+        </w:rPr>
+        <w:t>neuen Standard</w:t>
+      </w:r>
+      <w:r>
+        <w:t xml:space="preserve"> festlegen können, falls sich mein Stundenplan dauerhaft geändert hat.</w:t>
+      </w:r>
+    </w:p>
+    <w:p>
+      <w:pPr>
+        <w:numPr>
+          <w:ilvl w:val="0"/>
+          <w:numId w:val="20"/>
+        </w:numPr>
+      </w:pPr>
+      <w:r>
+        <w:rPr>
+          <w:b/>
+          <w:bCs/>
+        </w:rPr>
+        <w:t>Akzeptanzkriterien:</w:t>
+      </w:r>
+    </w:p>
+    <w:p>
+      <w:pPr>
+        <w:numPr>
+          <w:ilvl w:val="1"/>
+          <w:numId w:val="20"/>
+        </w:numPr>
+      </w:pPr>
+      <w:r>
+        <w:t>Es gibt eine Schaltfläche "Als neuen Standard speichern".</w:t>
+      </w:r>
+    </w:p>
+    <w:p>
+      <w:pPr>
+        <w:numPr>
+          <w:ilvl w:val="1"/>
+          <w:numId w:val="20"/>
+        </w:numPr>
+      </w:pPr>
+      <w:r>
+        <w:t>Das System überschreibt die alten Dauer-Einstellungen mit den aktuellen Wochen-Werten.</w:t>
+      </w:r>
+    </w:p>
+    <w:p>
+      <w:r>
+        <w:pict w14:anchorId="5472EC79">
+          <v:rect id="_x0000_i1091" style="width:0;height:1.5pt" o:hralign="center" o:hrstd="t" o:hrnoshade="t" o:hr="t" fillcolor="gray" stroked="f"/>
+        </w:pict>
+      </w:r>
+    </w:p>
+    <w:p>
+      <w:pPr>
+        <w:rPr>
+          <w:b/>
+          <w:bCs/>
+        </w:rPr>
+      </w:pPr>
+      <w:r>
+        <w:rPr>
+          <w:b/>
+          <w:bCs/>
+        </w:rPr>
+        <w:t>4. Visuelle Unterscheidung im Planer</w:t>
+      </w:r>
+    </w:p>
+    <w:p>
+      <w:r>
+        <w:rPr>
+          <w:i/>
+          <w:iCs/>
+        </w:rPr>
+        <w:t>Fokus: Transparenz darüber, woher die Zeit kommt.</w:t>
+      </w:r>
+    </w:p>
+    <w:p>
+      <w:pPr>
+        <w:numPr>
+          <w:ilvl w:val="0"/>
+          <w:numId w:val="21"/>
+        </w:numPr>
+      </w:pPr>
+      <w:r>
+        <w:rPr>
+          <w:b/>
+          <w:bCs/>
+        </w:rPr>
+        <w:t>Story:</w:t>
+      </w:r>
+      <w:r>
+        <w:t xml:space="preserve"> Als Nutzer möchte ich im Kalender sehen, ob ein Zeitfenster aus dem </w:t>
+      </w:r>
+      <w:r>
+        <w:rPr>
+          <w:b/>
+          <w:bCs/>
+        </w:rPr>
+        <w:t>Standard-Plan</w:t>
+      </w:r>
+      <w:r>
+        <w:t xml:space="preserve"> stammt oder </w:t>
+      </w:r>
+      <w:r>
+        <w:rPr>
+          <w:b/>
+          <w:bCs/>
+        </w:rPr>
+        <w:t>manuell für diese Woche</w:t>
+      </w:r>
+      <w:r>
+        <w:t xml:space="preserve"> angepasst wurde, damit ich meine Planungsgrundlage nachvollziehen kann.</w:t>
+      </w:r>
+    </w:p>
+    <w:p>
+      <w:pPr>
+        <w:numPr>
+          <w:ilvl w:val="0"/>
+          <w:numId w:val="21"/>
+        </w:numPr>
+      </w:pPr>
+      <w:r>
+        <w:rPr>
+          <w:b/>
+          <w:bCs/>
+        </w:rPr>
+        <w:t>Akzeptanzkriterien:</w:t>
+      </w:r>
+    </w:p>
+    <w:p>
+      <w:pPr>
+        <w:numPr>
+          <w:ilvl w:val="1"/>
+          <w:numId w:val="21"/>
+        </w:numPr>
+      </w:pPr>
+      <w:r>
+        <w:t>Manuell geänderte Slots werden farblich markiert (z. B. ein kleines Icon "Manuell angepasst").</w:t>
+      </w:r>
+    </w:p>
+    <w:p>
+      <w:pPr>
+        <w:numPr>
+          <w:ilvl w:val="1"/>
+          <w:numId w:val="21"/>
+        </w:numPr>
+      </w:pPr>
+      <w:r>
+        <w:t>Ein "</w:t>
+      </w:r>
+      <w:proofErr w:type="spellStart"/>
+      <w:r>
+        <w:t>Reset</w:t>
+      </w:r>
+      <w:proofErr w:type="spellEnd"/>
+      <w:r>
+        <w:t>"-Button erlaubt es, eine spezifische Woche sofort wieder auf die Standard-Werte zurückzusetzen.</w:t>
+      </w:r>
+    </w:p>
+    <w:p>
+      <w:r>
+        <w:lastRenderedPageBreak/>
+        <w:pict w14:anchorId="57E6CC1A">
+          <v:rect id="_x0000_i1092" style="width:0;height:1.5pt" o:hralign="center" o:hrstd="t" o:hrnoshade="t" o:hr="t" fillcolor="gray" stroked="f"/>
+        </w:pict>
+      </w:r>
+    </w:p>
+    <w:p>
+      <w:pPr>
+        <w:rPr>
+          <w:b/>
+          <w:bCs/>
+        </w:rPr>
+      </w:pPr>
+      <w:r>
+        <w:rPr>
+          <w:b/>
+          <w:bCs/>
+        </w:rPr>
+        <w:t>Technische Logik-Empfehlung für dein Skript:</w:t>
+      </w:r>
+    </w:p>
+    <w:p>
+      <w:r>
+        <w:t>Um das umzusetzen, müsstest du in deinem Code die Kapazitätsabfrage (</w:t>
+      </w:r>
+      <w:proofErr w:type="spellStart"/>
+      <w:r>
+        <w:t>getDayCapacity</w:t>
+      </w:r>
+      <w:proofErr w:type="spellEnd"/>
+      <w:r>
+        <w:t>) priorisieren:</w:t>
+      </w:r>
+    </w:p>
+    <w:p>
+      <w:pPr>
+        <w:numPr>
+          <w:ilvl w:val="0"/>
+          <w:numId w:val="22"/>
+        </w:numPr>
+      </w:pPr>
+      <w:r>
+        <w:rPr>
+          <w:b/>
+          <w:bCs/>
+        </w:rPr>
+        <w:t>Check:</w:t>
+      </w:r>
+      <w:r>
+        <w:t xml:space="preserve"> Gibt es einen Eintrag für das </w:t>
+      </w:r>
+      <w:r>
+        <w:rPr>
+          <w:b/>
+          <w:bCs/>
+        </w:rPr>
+        <w:t>spezifische Datum</w:t>
+      </w:r>
+      <w:r>
+        <w:t>? (Wenn ja: nimm diesen).</w:t>
+      </w:r>
+    </w:p>
+    <w:p>
+      <w:pPr>
+        <w:numPr>
+          <w:ilvl w:val="0"/>
+          <w:numId w:val="22"/>
+        </w:numPr>
+      </w:pPr>
+      <w:r>
+        <w:rPr>
+          <w:b/>
+          <w:bCs/>
+        </w:rPr>
+        <w:t>Check:</w:t>
+      </w:r>
+      <w:r>
+        <w:t xml:space="preserve"> Gibt es eine Abweichung für diese </w:t>
+      </w:r>
+      <w:r>
+        <w:rPr>
+          <w:b/>
+          <w:bCs/>
+        </w:rPr>
+        <w:t>Kalenderwoche</w:t>
+      </w:r>
+      <w:r>
+        <w:t>? (Wenn ja: nimm diesen).</w:t>
+      </w:r>
+    </w:p>
+    <w:p>
+      <w:pPr>
+        <w:numPr>
+          <w:ilvl w:val="0"/>
+          <w:numId w:val="22"/>
+        </w:numPr>
+      </w:pPr>
+      <w:proofErr w:type="spellStart"/>
+      <w:r>
+        <w:rPr>
+          <w:b/>
+          <w:bCs/>
+        </w:rPr>
+        <w:t>Fallback</w:t>
+      </w:r>
+      <w:proofErr w:type="spellEnd"/>
+      <w:r>
+        <w:rPr>
+          <w:b/>
+          <w:bCs/>
+        </w:rPr>
+        <w:t>:</w:t>
+      </w:r>
+      <w:r>
+        <w:t xml:space="preserve"> Nutze den </w:t>
+      </w:r>
+      <w:r>
+        <w:rPr>
+          <w:b/>
+          <w:bCs/>
+        </w:rPr>
+        <w:t>Standard-Slot</w:t>
+      </w:r>
+      <w:r>
+        <w:t xml:space="preserve"> für diesen Wochentag.</w:t>
+      </w:r>
+    </w:p>
+    <w:p>
+      <w:r>
+        <w:t>Soll ich dir erklären, wie du das Datenmodell in deinem JavaScript-Objekt strukturieren müsstest, um diese Hierarchie abzubilden?</w:t>
+      </w:r>
+    </w:p>
+    <w:p/>
+    <w:p>
+      <w:r>
+        <w:t xml:space="preserve">Das ist ein sehr wichtiger Punkt für die Übersichtlichkeit. Aktuell ist die Zielflagge nur ein einfaches Icon. Um die Deadlines </w:t>
+      </w:r>
+      <w:proofErr w:type="gramStart"/>
+      <w:r>
+        <w:t>wirklich intuitiv</w:t>
+      </w:r>
+      <w:proofErr w:type="gramEnd"/>
+      <w:r>
+        <w:t xml:space="preserve"> erfassbar zu machen, sollte man sie von normalen Aufgabenblöcken abheben.</w:t>
+      </w:r>
+    </w:p>
+    <w:p>
+      <w:r>
+        <w:t>Hier sind die User Stories für eine verbesserte Deadline-Visualisierung:</w:t>
+      </w:r>
+    </w:p>
+    <w:p>
+      <w:r>
+        <w:pict w14:anchorId="18A73881">
+          <v:rect id="_x0000_i1110" style="width:0;height:1.5pt" o:hralign="center" o:hrstd="t" o:hrnoshade="t" o:hr="t" fillcolor="gray" stroked="f"/>
+        </w:pict>
+      </w:r>
+    </w:p>
+    <w:p>
+      <w:pPr>
+        <w:rPr>
+          <w:b/>
+          <w:bCs/>
+        </w:rPr>
+      </w:pPr>
+      <w:r>
+        <w:rPr>
+          <w:b/>
+          <w:bCs/>
+        </w:rPr>
+        <w:t>1. Deadline-Karten &amp; "Countdown"-Optik</w:t>
+      </w:r>
+    </w:p>
+    <w:p>
+      <w:pPr>
+        <w:numPr>
+          <w:ilvl w:val="0"/>
+          <w:numId w:val="23"/>
+        </w:numPr>
+      </w:pPr>
+      <w:r>
+        <w:rPr>
+          <w:b/>
+          <w:bCs/>
+        </w:rPr>
+        <w:t>Story:</w:t>
+      </w:r>
+      <w:r>
+        <w:t xml:space="preserve"> Als Nutzer möchte ich, dass der Tag einer Deadline im Kalender eine </w:t>
+      </w:r>
+      <w:r>
+        <w:rPr>
+          <w:b/>
+          <w:bCs/>
+        </w:rPr>
+        <w:t>markante Hintergrundfarbe</w:t>
+      </w:r>
+      <w:r>
+        <w:t xml:space="preserve"> (z. B. ein sanftes Rot oder Gelb) erhält, damit ich beim Scrollen sofort sehe, wo die kritischen Fixpunkte liegen.</w:t>
+      </w:r>
+    </w:p>
+    <w:p>
+      <w:pPr>
+        <w:numPr>
+          <w:ilvl w:val="0"/>
+          <w:numId w:val="23"/>
+        </w:numPr>
+      </w:pPr>
+      <w:r>
+        <w:rPr>
+          <w:b/>
+          <w:bCs/>
+        </w:rPr>
+        <w:t>Story:</w:t>
+      </w:r>
+      <w:r>
+        <w:t xml:space="preserve"> Als Nutzer möchte ich, dass innerhalb der Kalenderzelle die </w:t>
+      </w:r>
+      <w:r>
+        <w:rPr>
+          <w:b/>
+          <w:bCs/>
+        </w:rPr>
+        <w:t>Bezeichnung der fälligen Aufgabe</w:t>
+      </w:r>
+      <w:r>
+        <w:t xml:space="preserve"> fett hervorgehoben wird (z. B. "</w:t>
+      </w:r>
+      <w:r>
+        <w:rPr>
+          <w:rFonts w:ascii="Segoe UI Emoji" w:hAnsi="Segoe UI Emoji" w:cs="Segoe UI Emoji"/>
+        </w:rPr>
+        <w:t>🏁</w:t>
+      </w:r>
+      <w:r>
+        <w:t xml:space="preserve"> ABGABE: Aufgabe A"), anstatt nur ein Icon zu sehen.</w:t>
+      </w:r>
+    </w:p>
+    <w:p>
+      <w:pPr>
+        <w:rPr>
+          <w:b/>
+          <w:bCs/>
+        </w:rPr>
+      </w:pPr>
+      <w:r>
+        <w:rPr>
+          <w:b/>
+          <w:bCs/>
+        </w:rPr>
+        <w:t>2. Zeitliche Distanz (Dringlichkeits-Indikator)</w:t>
+      </w:r>
+    </w:p>
+    <w:p>
+      <w:pPr>
+        <w:numPr>
+          <w:ilvl w:val="0"/>
+          <w:numId w:val="24"/>
+        </w:numPr>
+      </w:pPr>
+      <w:r>
+        <w:rPr>
+          <w:b/>
+          <w:bCs/>
+        </w:rPr>
+        <w:t>Story:</w:t>
+      </w:r>
+      <w:r>
+        <w:t xml:space="preserve"> Als Nutzer möchte ich, dass Tage, die kurz vor einer Deadline liegen (z. B. die letzten 3 Tage), einen </w:t>
+      </w:r>
+      <w:r>
+        <w:rPr>
+          <w:b/>
+          <w:bCs/>
+        </w:rPr>
+        <w:t>visuellen Warnhinweis</w:t>
+      </w:r>
+      <w:r>
+        <w:t xml:space="preserve"> erhalten, um den psychologischen Druck der näher rückenden Abgabe zu verdeutlichen.</w:t>
+      </w:r>
+    </w:p>
+    <w:p>
+      <w:pPr>
+        <w:numPr>
+          <w:ilvl w:val="0"/>
+          <w:numId w:val="24"/>
+        </w:numPr>
+      </w:pPr>
+      <w:r>
+        <w:rPr>
+          <w:b/>
+          <w:bCs/>
+        </w:rPr>
+        <w:t>Story:</w:t>
+      </w:r>
+      <w:r>
+        <w:t xml:space="preserve"> Als Nutzer möchte ich eine </w:t>
+      </w:r>
+      <w:r>
+        <w:rPr>
+          <w:b/>
+          <w:bCs/>
+        </w:rPr>
+        <w:t>"Tage bis..." Anzeige</w:t>
+      </w:r>
+      <w:r>
+        <w:t xml:space="preserve"> direkt auf der Deadline-Markierung sehen, damit ich nicht im Kopf rechnen muss, wie viel Zeit mir noch bleibt.</w:t>
+      </w:r>
+    </w:p>
+    <w:p>
+      <w:pPr>
+        <w:rPr>
+          <w:b/>
+          <w:bCs/>
+        </w:rPr>
+      </w:pPr>
+      <w:r>
+        <w:rPr>
+          <w:b/>
+          <w:bCs/>
+        </w:rPr>
+        <w:t>3. Interaktive Deadline-Details</w:t>
+      </w:r>
+    </w:p>
+    <w:p>
+      <w:pPr>
+        <w:numPr>
+          <w:ilvl w:val="0"/>
+          <w:numId w:val="25"/>
+        </w:numPr>
+      </w:pPr>
+      <w:r>
+        <w:rPr>
+          <w:b/>
+          <w:bCs/>
+        </w:rPr>
+        <w:lastRenderedPageBreak/>
+        <w:t>Story:</w:t>
+      </w:r>
+      <w:r>
+        <w:t xml:space="preserve"> Als Nutzer möchte ich auf das Deadline-Icon klicken können, um eine </w:t>
+      </w:r>
+      <w:r>
+        <w:rPr>
+          <w:b/>
+          <w:bCs/>
+        </w:rPr>
+        <w:t>Zusammenfassung</w:t>
+      </w:r>
+      <w:r>
+        <w:t xml:space="preserve"> zu erhalten (z. B. "Gesamtstunden investiert: 10h / </w:t>
+      </w:r>
+      <w:proofErr w:type="gramStart"/>
+      <w:r>
+        <w:t>Offen</w:t>
+      </w:r>
+      <w:proofErr w:type="gramEnd"/>
+      <w:r>
+        <w:t>: 0h"), damit ich sicherstellen kann, dass alles für die Abgabe bereit ist.</w:t>
+      </w:r>
+    </w:p>
+    <w:p>
+      <w:r>
+        <w:pict w14:anchorId="622F7431">
+          <v:rect id="_x0000_i1111" style="width:0;height:1.5pt" o:hralign="center" o:hrstd="t" o:hrnoshade="t" o:hr="t" fillcolor="gray" stroked="f"/>
+        </w:pict>
+      </w:r>
+    </w:p>
+    <w:p>
+      <w:pPr>
+        <w:rPr>
+          <w:b/>
+          <w:bCs/>
+        </w:rPr>
+      </w:pPr>
+      <w:r>
+        <w:rPr>
+          <w:b/>
+          <w:bCs/>
+        </w:rPr>
+        <w:t>Vorschlag für die technische Umsetzung (UI-Logik)</w:t>
+      </w:r>
+    </w:p>
+    <w:p>
+      <w:r>
+        <w:t xml:space="preserve">Um das in deinem bestehenden Code umzusetzen, könntest du die </w:t>
+      </w:r>
+      <w:proofErr w:type="spellStart"/>
+      <w:r>
+        <w:t>renderResults</w:t>
+      </w:r>
+      <w:proofErr w:type="spellEnd"/>
+      <w:r>
+        <w:t>-Schleife in der Kalenderansicht wie folgt erweitern:</w:t>
+      </w:r>
+    </w:p>
+    <w:p>
+      <w:r>
+        <w:rPr>
+          <w:b/>
+          <w:bCs/>
+        </w:rPr>
+        <w:t>1. CSS-Klasse für Deadline-Tage:</w:t>
+      </w:r>
+    </w:p>
+    <w:p>
+      <w:r>
+        <w:t>Statt nur ein Icon einzufügen, gib der gesamten Zelle (</w:t>
+      </w:r>
+      <w:proofErr w:type="spellStart"/>
+      <w:r>
+        <w:t>day-cell</w:t>
+      </w:r>
+      <w:proofErr w:type="spellEnd"/>
+      <w:r>
+        <w:t>) eine Klasse .</w:t>
+      </w:r>
+      <w:proofErr w:type="spellStart"/>
+      <w:r>
+        <w:t>is</w:t>
+      </w:r>
+      <w:proofErr w:type="spellEnd"/>
+      <w:r>
+        <w:t>-deadline.</w:t>
+      </w:r>
+    </w:p>
+    <w:p>
+      <w:r>
+        <w:t>CSS</w:t>
+      </w:r>
+    </w:p>
+    <w:p>
+      <w:proofErr w:type="gramStart"/>
+      <w:r>
+        <w:t>.day-cell.is</w:t>
+      </w:r>
+      <w:proofErr w:type="gramEnd"/>
+      <w:r>
+        <w:t>-deadline {</w:t>
+      </w:r>
+    </w:p>
+    <w:p>
+      <w:r>
+        <w:t xml:space="preserve">  </w:t>
+      </w:r>
+      <w:proofErr w:type="spellStart"/>
+      <w:r>
+        <w:t>border</w:t>
+      </w:r>
+      <w:proofErr w:type="spellEnd"/>
+      <w:r>
+        <w:t>: 2px solid #ff4d4d;</w:t>
+      </w:r>
+    </w:p>
+    <w:p>
+      <w:r>
+        <w:t xml:space="preserve">  background-color: </w:t>
+      </w:r>
+      <w:proofErr w:type="spellStart"/>
+      <w:proofErr w:type="gramStart"/>
+      <w:r>
+        <w:t>rgba</w:t>
+      </w:r>
+      <w:proofErr w:type="spellEnd"/>
+      <w:r>
+        <w:t>(</w:t>
+      </w:r>
+      <w:proofErr w:type="gramEnd"/>
+      <w:r>
+        <w:t>255, 77, 77, 0.05);</w:t>
+      </w:r>
+    </w:p>
+    <w:p>
+      <w:r>
+        <w:t>}</w:t>
+      </w:r>
+    </w:p>
+    <w:p>
+      <w:proofErr w:type="gramStart"/>
+      <w:r>
+        <w:t>.</w:t>
+      </w:r>
+      <w:proofErr w:type="spellStart"/>
+      <w:r>
+        <w:t>deadline</w:t>
+      </w:r>
+      <w:proofErr w:type="gramEnd"/>
+      <w:r>
+        <w:t>-badge</w:t>
+      </w:r>
+      <w:proofErr w:type="spellEnd"/>
+      <w:r>
+        <w:t xml:space="preserve"> {</w:t>
+      </w:r>
+    </w:p>
+    <w:p>
+      <w:r>
+        <w:t xml:space="preserve">  </w:t>
+      </w:r>
+      <w:proofErr w:type="spellStart"/>
+      <w:r>
+        <w:t>background</w:t>
+      </w:r>
+      <w:proofErr w:type="spellEnd"/>
+      <w:r>
+        <w:t>: #ff4d4d;</w:t>
+      </w:r>
+    </w:p>
+    <w:p>
+      <w:r>
+        <w:t xml:space="preserve">  </w:t>
+      </w:r>
+      <w:proofErr w:type="spellStart"/>
+      <w:r>
+        <w:t>color</w:t>
+      </w:r>
+      <w:proofErr w:type="spellEnd"/>
+      <w:r>
+        <w:t xml:space="preserve">: </w:t>
+      </w:r>
+      <w:proofErr w:type="spellStart"/>
+      <w:r>
+        <w:t>white</w:t>
+      </w:r>
+      <w:proofErr w:type="spellEnd"/>
+      <w:r>
+        <w:t>;</w:t>
+      </w:r>
+    </w:p>
+    <w:p>
+      <w:r>
+        <w:t xml:space="preserve">  </w:t>
+      </w:r>
+      <w:proofErr w:type="spellStart"/>
+      <w:r>
+        <w:t>font</w:t>
+      </w:r>
+      <w:proofErr w:type="spellEnd"/>
+      <w:r>
+        <w:t>-size: 0.7rem;</w:t>
+      </w:r>
+    </w:p>
+    <w:p>
+      <w:r>
+        <w:t xml:space="preserve">  </w:t>
+      </w:r>
+      <w:proofErr w:type="spellStart"/>
+      <w:r>
+        <w:t>padding</w:t>
+      </w:r>
+      <w:proofErr w:type="spellEnd"/>
+      <w:r>
+        <w:t>: 2px 5px;</w:t>
+      </w:r>
+    </w:p>
+    <w:p>
+      <w:r>
+        <w:t xml:space="preserve">  </w:t>
+      </w:r>
+      <w:proofErr w:type="spellStart"/>
+      <w:r>
+        <w:t>border</w:t>
+      </w:r>
+      <w:proofErr w:type="spellEnd"/>
+      <w:r>
+        <w:t>-radius: 4px;</w:t>
+      </w:r>
+    </w:p>
+    <w:p>
+      <w:r>
+        <w:t xml:space="preserve">  </w:t>
+      </w:r>
+      <w:proofErr w:type="spellStart"/>
+      <w:r>
+        <w:t>font-weight</w:t>
+      </w:r>
+      <w:proofErr w:type="spellEnd"/>
+      <w:r>
+        <w:t xml:space="preserve">: </w:t>
+      </w:r>
+      <w:proofErr w:type="spellStart"/>
+      <w:r>
+        <w:t>bold</w:t>
+      </w:r>
+      <w:proofErr w:type="spellEnd"/>
+      <w:r>
+        <w:t>;</w:t>
+      </w:r>
+    </w:p>
+    <w:p>
+      <w:r>
+        <w:t xml:space="preserve">  </w:t>
+      </w:r>
+      <w:proofErr w:type="spellStart"/>
+      <w:r>
+        <w:t>display</w:t>
+      </w:r>
+      <w:proofErr w:type="spellEnd"/>
+      <w:r>
+        <w:t>: block;</w:t>
+      </w:r>
+    </w:p>
+    <w:p>
+      <w:r>
+        <w:t xml:space="preserve">  </w:t>
+      </w:r>
+      <w:proofErr w:type="spellStart"/>
+      <w:r>
+        <w:t>margin</w:t>
+      </w:r>
+      <w:proofErr w:type="spellEnd"/>
+      <w:r>
+        <w:t>-top: 2px;</w:t>
+      </w:r>
+    </w:p>
+    <w:p>
+      <w:r>
+        <w:t>}</w:t>
+      </w:r>
+    </w:p>
+    <w:p>
+      <w:r>
+        <w:rPr>
+          <w:b/>
+          <w:bCs/>
+        </w:rPr>
+        <w:t>2. JavaScript-Anpassung in der Kalender-Schleife:</w:t>
+      </w:r>
+    </w:p>
+    <w:p>
+      <w:r>
+        <w:t xml:space="preserve">Ersetze den Teil, der die </w:t>
+      </w:r>
+      <w:proofErr w:type="spellStart"/>
+      <w:r>
+        <w:t>deadline-flag</w:t>
+      </w:r>
+      <w:proofErr w:type="spellEnd"/>
+      <w:r>
+        <w:t xml:space="preserve"> zeichnet, durch eine detailliertere Anzeige:</w:t>
+      </w:r>
+    </w:p>
+    <w:p>
+      <w:r>
+        <w:t>JavaScript</w:t>
+      </w:r>
+    </w:p>
+    <w:p>
+      <w:proofErr w:type="spellStart"/>
+      <w:r>
+        <w:t>const</w:t>
+      </w:r>
+      <w:proofErr w:type="spellEnd"/>
+      <w:r>
+        <w:t xml:space="preserve"> </w:t>
+      </w:r>
+      <w:proofErr w:type="spellStart"/>
+      <w:r>
+        <w:t>deadlinesForThisDay</w:t>
+      </w:r>
+      <w:proofErr w:type="spellEnd"/>
+      <w:r>
+        <w:t xml:space="preserve"> = </w:t>
+      </w:r>
+      <w:proofErr w:type="spellStart"/>
+      <w:proofErr w:type="gramStart"/>
+      <w:r>
+        <w:t>tasks.filter</w:t>
+      </w:r>
+      <w:proofErr w:type="spellEnd"/>
+      <w:proofErr w:type="gramEnd"/>
+      <w:r>
+        <w:t xml:space="preserve">(t =&gt; </w:t>
+      </w:r>
+      <w:proofErr w:type="spellStart"/>
+      <w:proofErr w:type="gramStart"/>
+      <w:r>
+        <w:t>t.deadline</w:t>
+      </w:r>
+      <w:proofErr w:type="spellEnd"/>
+      <w:proofErr w:type="gramEnd"/>
+      <w:r>
+        <w:t xml:space="preserve"> === </w:t>
+      </w:r>
+      <w:proofErr w:type="spellStart"/>
+      <w:r>
+        <w:t>dateStr</w:t>
+      </w:r>
+      <w:proofErr w:type="spellEnd"/>
+      <w:r>
+        <w:t>);</w:t>
+      </w:r>
+    </w:p>
+    <w:p>
+      <w:proofErr w:type="spellStart"/>
+      <w:r>
+        <w:t>if</w:t>
+      </w:r>
+      <w:proofErr w:type="spellEnd"/>
+      <w:r>
+        <w:t xml:space="preserve"> (</w:t>
+      </w:r>
+      <w:proofErr w:type="spellStart"/>
+      <w:r>
+        <w:t>deadlinesForThisDay.length</w:t>
+      </w:r>
+      <w:proofErr w:type="spellEnd"/>
+      <w:r>
+        <w:t xml:space="preserve"> &gt; 0) {</w:t>
+      </w:r>
+    </w:p>
+    <w:p>
+      <w:r>
+        <w:lastRenderedPageBreak/>
+        <w:t xml:space="preserve">    </w:t>
+      </w:r>
+      <w:proofErr w:type="spellStart"/>
+      <w:r>
+        <w:t>deadlinesForThisDay.forEach</w:t>
+      </w:r>
+      <w:proofErr w:type="spellEnd"/>
+      <w:r>
+        <w:t>(</w:t>
+      </w:r>
+      <w:proofErr w:type="spellStart"/>
+      <w:r>
+        <w:t>task</w:t>
+      </w:r>
+      <w:proofErr w:type="spellEnd"/>
+      <w:r>
+        <w:t xml:space="preserve"> =&gt; {</w:t>
+      </w:r>
+    </w:p>
+    <w:p>
+      <w:r>
+        <w:t xml:space="preserve">        </w:t>
+      </w:r>
+      <w:proofErr w:type="spellStart"/>
+      <w:r>
+        <w:t>html</w:t>
+      </w:r>
+      <w:proofErr w:type="spellEnd"/>
+      <w:r>
+        <w:t xml:space="preserve"> += `&lt;div </w:t>
+      </w:r>
+      <w:proofErr w:type="spellStart"/>
+      <w:r>
+        <w:t>class</w:t>
+      </w:r>
+      <w:proofErr w:type="spellEnd"/>
+      <w:r>
+        <w:t>="</w:t>
+      </w:r>
+      <w:proofErr w:type="spellStart"/>
+      <w:r>
+        <w:t>deadline-badge</w:t>
+      </w:r>
+      <w:proofErr w:type="spellEnd"/>
+      <w:r>
+        <w:t>"&gt;</w:t>
+      </w:r>
+      <w:r>
+        <w:rPr>
+          <w:rFonts w:ascii="Segoe UI Emoji" w:hAnsi="Segoe UI Emoji" w:cs="Segoe UI Emoji"/>
+        </w:rPr>
+        <w:t>🏁</w:t>
+      </w:r>
+      <w:r>
+        <w:t xml:space="preserve"> FÄLLIG: ${</w:t>
+      </w:r>
+      <w:proofErr w:type="spellStart"/>
+      <w:proofErr w:type="gramStart"/>
+      <w:r>
+        <w:t>task.title</w:t>
+      </w:r>
+      <w:proofErr w:type="spellEnd"/>
+      <w:proofErr w:type="gramEnd"/>
+      <w:r>
+        <w:t>}&lt;/div&gt;`;</w:t>
+      </w:r>
+    </w:p>
+    <w:p>
+      <w:r>
+        <w:t xml:space="preserve">    });</w:t>
+      </w:r>
+    </w:p>
+    <w:p>
+      <w:r>
+        <w:t>}</w:t>
+      </w:r>
+    </w:p>
+    <w:p>
+      <w:pPr>
+        <w:rPr>
+          <w:b/>
+          <w:bCs/>
+        </w:rPr>
+      </w:pPr>
+      <w:r>
+        <w:rPr>
+          <w:b/>
+          <w:bCs/>
+        </w:rPr>
+        <w:t>Zusammenfassung der Anweisungen für dich:</w:t>
+      </w:r>
+    </w:p>
+    <w:p>
+      <w:pPr>
+        <w:numPr>
+          <w:ilvl w:val="0"/>
+          <w:numId w:val="26"/>
+        </w:numPr>
+      </w:pPr>
+      <w:r>
+        <w:rPr>
+          <w:b/>
+          <w:bCs/>
+        </w:rPr>
+        <w:t>Vom Icon zum Banner:</w:t>
+      </w:r>
+      <w:r>
+        <w:t xml:space="preserve"> Ersetze das </w:t>
+      </w:r>
+      <w:r>
+        <w:rPr>
+          <w:rFonts w:ascii="Segoe UI Emoji" w:hAnsi="Segoe UI Emoji" w:cs="Segoe UI Emoji"/>
+        </w:rPr>
+        <w:t>🏁</w:t>
+      </w:r>
+      <w:r>
+        <w:t xml:space="preserve"> durch ein farbiges Label (&lt;div&gt;), das den Namen der Aufgabe enthält.</w:t>
+      </w:r>
+    </w:p>
+    <w:p>
+      <w:pPr>
+        <w:numPr>
+          <w:ilvl w:val="0"/>
+          <w:numId w:val="26"/>
+        </w:numPr>
+      </w:pPr>
+      <w:r>
+        <w:rPr>
+          <w:b/>
+          <w:bCs/>
+        </w:rPr>
+        <w:t>Zellen-Hervorhebung:</w:t>
+      </w:r>
+      <w:r>
+        <w:t xml:space="preserve"> Färbe den Rahmen oder den Hintergrund der gesamten Kalenderzelle ein, wenn dort eine Deadline liegt.</w:t>
+      </w:r>
+    </w:p>
+    <w:p>
+      <w:pPr>
+        <w:numPr>
+          <w:ilvl w:val="0"/>
+          <w:numId w:val="26"/>
+        </w:numPr>
+      </w:pPr>
+      <w:r>
+        <w:rPr>
+          <w:b/>
+          <w:bCs/>
+        </w:rPr>
+        <w:t>Priorisierung:</w:t>
+      </w:r>
+      <w:r>
+        <w:t xml:space="preserve"> Wenn mehrere Deadlines an einem Tag liegen, staple diese untereinander am oberen Rand der Zelle, damit sie vor den Lernblöcken erscheinen.</w:t>
+      </w:r>
+    </w:p>
+    <w:p>
+      <w:r>
+        <w:t>Welchen dieser Punkte findest du am wichtigsten für dein Tool? Ich kann dir gezielt die CSS-Stile dafür schreiben.</w:t>
+      </w:r>
     </w:p>
     <w:p/>
     <w:sectPr>
@@ -1534,6 +3187,119 @@
 <file path=word/numbering.xml><?xml version="1.0" encoding="utf-8"?>
 <w:numbering xmlns:wpc="http://schemas.microsoft.com/office/word/2010/wordprocessingCanvas" xmlns:cx="http://schemas.microsoft.com/office/drawing/2014/chartex" xmlns:cx1="http://schemas.microsoft.com/office/drawing/2015/9/8/chartex" xmlns:cx2="http://schemas.microsoft.com/office/drawing/2015/10/21/chartex" xmlns:cx3="http://schemas.microsoft.com/office/drawing/2016/5/9/chartex" xmlns:cx4="http://schemas.microsoft.com/office/drawing/2016/5/10/chartex" xmlns:cx5="http://schemas.microsoft.com/office/drawing/2016/5/11/chartex" xmlns:cx6="http://schemas.microsoft.com/office/drawing/2016/5/12/chartex" xmlns:cx7="http://schemas.microsoft.com/office/drawing/2016/5/13/chartex" xmlns:cx8="http://schemas.microsoft.com/office/drawing/2016/5/14/chartex" xmlns:mc="http://schemas.openxmlformats.org/markup-compatibility/2006" xmlns:aink="http://schemas.microsoft.com/office/drawing/2016/ink" xmlns:am3d="http://schemas.microsoft.com/office/drawing/2017/model3d" xmlns:o="urn:schemas-microsoft-com:office:office" xmlns:oel="http://schemas.microsoft.com/office/2019/extlst" xmlns:r="http://schemas.openxmlformats.org/officeDocument/2006/relationships" xmlns:m="http://schemas.openxmlformats.org/officeDocument/2006/math" xmlns:v="urn:schemas-microsoft-com:vml" xmlns:wp14="http://schemas.microsoft.com/office/word/2010/wordprocessingDrawing" xmlns:wp="http://schemas.openxmlformats.org/drawingml/2006/wordprocessingDrawing" xmlns:w10="urn:schemas-microsoft-com:office:word" xmlns:w="http://schemas.openxmlformats.org/wordprocessingml/2006/main" xmlns:w14="http://schemas.microsoft.com/office/word/2010/wordml" xmlns:w15="http://schemas.microsoft.com/office/word/2012/wordml" xmlns:w16cex="http://schemas.microsoft.com/office/word/2018/wordml/cex" xmlns:w16cid="http://schemas.microsoft.com/office/word/2016/wordml/cid" xmlns:w16="http://schemas.microsoft.com/office/word/2018/wordml" xmlns:w16du="http://schemas.microsoft.com/office/word/2023/wordml/word16du" xmlns:w16sdtdh="http://schemas.microsoft.com/office/word/2020/wordml/sdtdatahash" xmlns:w16sdtfl="http://schemas.microsoft.com/office/word/2024/wordml/sdtformatlock" xmlns:w16se="http://schemas.microsoft.com/office/word/2015/wordml/symex" xmlns:wpg="http://schemas.microsoft.com/office/word/2010/wordprocessingGroup" xmlns:wpi="http://schemas.microsoft.com/office/word/2010/wordprocessingInk" xmlns:wne="http://schemas.microsoft.com/office/word/2006/wordml" xmlns:wps="http://schemas.microsoft.com/office/word/2010/wordprocessingShape" mc:Ignorable="w14 w15 w16se w16cid w16 w16cex w16sdtdh w16sdtfl w16du wp14">
   <w:abstractNum w:abstractNumId="0" w15:restartNumberingAfterBreak="0">
+    <w:nsid w:val="00CB260D"/>
+    <w:multiLevelType w:val="multilevel"/>
+    <w:tmpl w:val="F5C631A0"/>
+    <w:lvl w:ilvl="0">
+      <w:start w:val="1"/>
+      <w:numFmt w:val="decimal"/>
+      <w:lvlText w:val="%1."/>
+      <w:lvlJc w:val="left"/>
+      <w:pPr>
+        <w:tabs>
+          <w:tab w:val="num" w:pos="720"/>
+        </w:tabs>
+        <w:ind w:left="720" w:hanging="360"/>
+      </w:pPr>
+    </w:lvl>
+    <w:lvl w:ilvl="1" w:tentative="1">
+      <w:start w:val="1"/>
+      <w:numFmt w:val="decimal"/>
+      <w:lvlText w:val="%2."/>
+      <w:lvlJc w:val="left"/>
+      <w:pPr>
+        <w:tabs>
+          <w:tab w:val="num" w:pos="1440"/>
+        </w:tabs>
+        <w:ind w:left="1440" w:hanging="360"/>
+      </w:pPr>
+    </w:lvl>
+    <w:lvl w:ilvl="2" w:tentative="1">
+      <w:start w:val="1"/>
+      <w:numFmt w:val="decimal"/>
+      <w:lvlText w:val="%3."/>
+      <w:lvlJc w:val="left"/>
+      <w:pPr>
+        <w:tabs>
+          <w:tab w:val="num" w:pos="2160"/>
+        </w:tabs>
+        <w:ind w:left="2160" w:hanging="360"/>
+      </w:pPr>
+    </w:lvl>
+    <w:lvl w:ilvl="3" w:tentative="1">
+      <w:start w:val="1"/>
+      <w:numFmt w:val="decimal"/>
+      <w:lvlText w:val="%4."/>
+      <w:lvlJc w:val="left"/>
+      <w:pPr>
+        <w:tabs>
+          <w:tab w:val="num" w:pos="2880"/>
+        </w:tabs>
+        <w:ind w:left="2880" w:hanging="360"/>
+      </w:pPr>
+    </w:lvl>
+    <w:lvl w:ilvl="4" w:tentative="1">
+      <w:start w:val="1"/>
+      <w:numFmt w:val="decimal"/>
+      <w:lvlText w:val="%5."/>
+      <w:lvlJc w:val="left"/>
+      <w:pPr>
+        <w:tabs>
+          <w:tab w:val="num" w:pos="3600"/>
+        </w:tabs>
+        <w:ind w:left="3600" w:hanging="360"/>
+      </w:pPr>
+    </w:lvl>
+    <w:lvl w:ilvl="5" w:tentative="1">
+      <w:start w:val="1"/>
+      <w:numFmt w:val="decimal"/>
+      <w:lvlText w:val="%6."/>
+      <w:lvlJc w:val="left"/>
+      <w:pPr>
+        <w:tabs>
+          <w:tab w:val="num" w:pos="4320"/>
+        </w:tabs>
+        <w:ind w:left="4320" w:hanging="360"/>
+      </w:pPr>
+    </w:lvl>
+    <w:lvl w:ilvl="6" w:tentative="1">
+      <w:start w:val="1"/>
+      <w:numFmt w:val="decimal"/>
+      <w:lvlText w:val="%7."/>
+      <w:lvlJc w:val="left"/>
+      <w:pPr>
+        <w:tabs>
+          <w:tab w:val="num" w:pos="5040"/>
+        </w:tabs>
+        <w:ind w:left="5040" w:hanging="360"/>
+      </w:pPr>
+    </w:lvl>
+    <w:lvl w:ilvl="7" w:tentative="1">
+      <w:start w:val="1"/>
+      <w:numFmt w:val="decimal"/>
+      <w:lvlText w:val="%8."/>
+      <w:lvlJc w:val="left"/>
+      <w:pPr>
+        <w:tabs>
+          <w:tab w:val="num" w:pos="5760"/>
+        </w:tabs>
+        <w:ind w:left="5760" w:hanging="360"/>
+      </w:pPr>
+    </w:lvl>
+    <w:lvl w:ilvl="8" w:tentative="1">
+      <w:start w:val="1"/>
+      <w:numFmt w:val="decimal"/>
+      <w:lvlText w:val="%9."/>
+      <w:lvlJc w:val="left"/>
+      <w:pPr>
+        <w:tabs>
+          <w:tab w:val="num" w:pos="6480"/>
+        </w:tabs>
+        <w:ind w:left="6480" w:hanging="360"/>
+      </w:pPr>
+    </w:lvl>
+  </w:abstractNum>
+  <w:abstractNum w:abstractNumId="1" w15:restartNumberingAfterBreak="0">
     <w:nsid w:val="01891017"/>
     <w:multiLevelType w:val="multilevel"/>
     <w:tmpl w:val="CE9EFE4A"/>
@@ -1682,7 +3448,7 @@
       </w:rPr>
     </w:lvl>
   </w:abstractNum>
-  <w:abstractNum w:abstractNumId="1" w15:restartNumberingAfterBreak="0">
+  <w:abstractNum w:abstractNumId="2" w15:restartNumberingAfterBreak="0">
     <w:nsid w:val="06D41A3C"/>
     <w:multiLevelType w:val="multilevel"/>
     <w:tmpl w:val="474A4002"/>
@@ -1831,7 +3597,7 @@
       </w:rPr>
     </w:lvl>
   </w:abstractNum>
-  <w:abstractNum w:abstractNumId="2" w15:restartNumberingAfterBreak="0">
+  <w:abstractNum w:abstractNumId="3" w15:restartNumberingAfterBreak="0">
     <w:nsid w:val="0E3C4594"/>
     <w:multiLevelType w:val="multilevel"/>
     <w:tmpl w:val="1CB0ECD4"/>
@@ -1980,7 +3746,305 @@
       </w:rPr>
     </w:lvl>
   </w:abstractNum>
-  <w:abstractNum w:abstractNumId="3" w15:restartNumberingAfterBreak="0">
+  <w:abstractNum w:abstractNumId="4" w15:restartNumberingAfterBreak="0">
+    <w:nsid w:val="0EB15DA1"/>
+    <w:multiLevelType w:val="multilevel"/>
+    <w:tmpl w:val="5532EB5E"/>
+    <w:lvl w:ilvl="0">
+      <w:start w:val="1"/>
+      <w:numFmt w:val="bullet"/>
+      <w:lvlText w:val=""/>
+      <w:lvlJc w:val="left"/>
+      <w:pPr>
+        <w:tabs>
+          <w:tab w:val="num" w:pos="720"/>
+        </w:tabs>
+        <w:ind w:left="720" w:hanging="360"/>
+      </w:pPr>
+      <w:rPr>
+        <w:rFonts w:ascii="Symbol" w:hAnsi="Symbol" w:hint="default"/>
+        <w:sz w:val="20"/>
+      </w:rPr>
+    </w:lvl>
+    <w:lvl w:ilvl="1" w:tentative="1">
+      <w:start w:val="1"/>
+      <w:numFmt w:val="bullet"/>
+      <w:lvlText w:val="o"/>
+      <w:lvlJc w:val="left"/>
+      <w:pPr>
+        <w:tabs>
+          <w:tab w:val="num" w:pos="1440"/>
+        </w:tabs>
+        <w:ind w:left="1440" w:hanging="360"/>
+      </w:pPr>
+      <w:rPr>
+        <w:rFonts w:ascii="Courier New" w:hAnsi="Courier New" w:hint="default"/>
+        <w:sz w:val="20"/>
+      </w:rPr>
+    </w:lvl>
+    <w:lvl w:ilvl="2" w:tentative="1">
+      <w:start w:val="1"/>
+      <w:numFmt w:val="bullet"/>
+      <w:lvlText w:val=""/>
+      <w:lvlJc w:val="left"/>
+      <w:pPr>
+        <w:tabs>
+          <w:tab w:val="num" w:pos="2160"/>
+        </w:tabs>
+        <w:ind w:left="2160" w:hanging="360"/>
+      </w:pPr>
+      <w:rPr>
+        <w:rFonts w:ascii="Wingdings" w:hAnsi="Wingdings" w:hint="default"/>
+        <w:sz w:val="20"/>
+      </w:rPr>
+    </w:lvl>
+    <w:lvl w:ilvl="3" w:tentative="1">
+      <w:start w:val="1"/>
+      <w:numFmt w:val="bullet"/>
+      <w:lvlText w:val=""/>
+      <w:lvlJc w:val="left"/>
+      <w:pPr>
+        <w:tabs>
+          <w:tab w:val="num" w:pos="2880"/>
+        </w:tabs>
+        <w:ind w:left="2880" w:hanging="360"/>
+      </w:pPr>
+      <w:rPr>
+        <w:rFonts w:ascii="Wingdings" w:hAnsi="Wingdings" w:hint="default"/>
+        <w:sz w:val="20"/>
+      </w:rPr>
+    </w:lvl>
+    <w:lvl w:ilvl="4" w:tentative="1">
+      <w:start w:val="1"/>
+      <w:numFmt w:val="bullet"/>
+      <w:lvlText w:val=""/>
+      <w:lvlJc w:val="left"/>
+      <w:pPr>
+        <w:tabs>
+          <w:tab w:val="num" w:pos="3600"/>
+        </w:tabs>
+        <w:ind w:left="3600" w:hanging="360"/>
+      </w:pPr>
+      <w:rPr>
+        <w:rFonts w:ascii="Wingdings" w:hAnsi="Wingdings" w:hint="default"/>
+        <w:sz w:val="20"/>
+      </w:rPr>
+    </w:lvl>
+    <w:lvl w:ilvl="5" w:tentative="1">
+      <w:start w:val="1"/>
+      <w:numFmt w:val="bullet"/>
+      <w:lvlText w:val=""/>
+      <w:lvlJc w:val="left"/>
+      <w:pPr>
+        <w:tabs>
+          <w:tab w:val="num" w:pos="4320"/>
+        </w:tabs>
+        <w:ind w:left="4320" w:hanging="360"/>
+      </w:pPr>
+      <w:rPr>
+        <w:rFonts w:ascii="Wingdings" w:hAnsi="Wingdings" w:hint="default"/>
+        <w:sz w:val="20"/>
+      </w:rPr>
+    </w:lvl>
+    <w:lvl w:ilvl="6" w:tentative="1">
+      <w:start w:val="1"/>
+      <w:numFmt w:val="bullet"/>
+      <w:lvlText w:val=""/>
+      <w:lvlJc w:val="left"/>
+      <w:pPr>
+        <w:tabs>
+          <w:tab w:val="num" w:pos="5040"/>
+        </w:tabs>
+        <w:ind w:left="5040" w:hanging="360"/>
+      </w:pPr>
+      <w:rPr>
+        <w:rFonts w:ascii="Wingdings" w:hAnsi="Wingdings" w:hint="default"/>
+        <w:sz w:val="20"/>
+      </w:rPr>
+    </w:lvl>
+    <w:lvl w:ilvl="7" w:tentative="1">
+      <w:start w:val="1"/>
+      <w:numFmt w:val="bullet"/>
+      <w:lvlText w:val=""/>
+      <w:lvlJc w:val="left"/>
+      <w:pPr>
+        <w:tabs>
+          <w:tab w:val="num" w:pos="5760"/>
+        </w:tabs>
+        <w:ind w:left="5760" w:hanging="360"/>
+      </w:pPr>
+      <w:rPr>
+        <w:rFonts w:ascii="Wingdings" w:hAnsi="Wingdings" w:hint="default"/>
+        <w:sz w:val="20"/>
+      </w:rPr>
+    </w:lvl>
+    <w:lvl w:ilvl="8" w:tentative="1">
+      <w:start w:val="1"/>
+      <w:numFmt w:val="bullet"/>
+      <w:lvlText w:val=""/>
+      <w:lvlJc w:val="left"/>
+      <w:pPr>
+        <w:tabs>
+          <w:tab w:val="num" w:pos="6480"/>
+        </w:tabs>
+        <w:ind w:left="6480" w:hanging="360"/>
+      </w:pPr>
+      <w:rPr>
+        <w:rFonts w:ascii="Wingdings" w:hAnsi="Wingdings" w:hint="default"/>
+        <w:sz w:val="20"/>
+      </w:rPr>
+    </w:lvl>
+  </w:abstractNum>
+  <w:abstractNum w:abstractNumId="5" w15:restartNumberingAfterBreak="0">
+    <w:nsid w:val="0F3644EC"/>
+    <w:multiLevelType w:val="multilevel"/>
+    <w:tmpl w:val="C0D2F2D8"/>
+    <w:lvl w:ilvl="0">
+      <w:start w:val="1"/>
+      <w:numFmt w:val="bullet"/>
+      <w:lvlText w:val=""/>
+      <w:lvlJc w:val="left"/>
+      <w:pPr>
+        <w:tabs>
+          <w:tab w:val="num" w:pos="720"/>
+        </w:tabs>
+        <w:ind w:left="720" w:hanging="360"/>
+      </w:pPr>
+      <w:rPr>
+        <w:rFonts w:ascii="Symbol" w:hAnsi="Symbol" w:hint="default"/>
+        <w:sz w:val="20"/>
+      </w:rPr>
+    </w:lvl>
+    <w:lvl w:ilvl="1" w:tentative="1">
+      <w:start w:val="1"/>
+      <w:numFmt w:val="bullet"/>
+      <w:lvlText w:val="o"/>
+      <w:lvlJc w:val="left"/>
+      <w:pPr>
+        <w:tabs>
+          <w:tab w:val="num" w:pos="1440"/>
+        </w:tabs>
+        <w:ind w:left="1440" w:hanging="360"/>
+      </w:pPr>
+      <w:rPr>
+        <w:rFonts w:ascii="Courier New" w:hAnsi="Courier New" w:hint="default"/>
+        <w:sz w:val="20"/>
+      </w:rPr>
+    </w:lvl>
+    <w:lvl w:ilvl="2" w:tentative="1">
+      <w:start w:val="1"/>
+      <w:numFmt w:val="bullet"/>
+      <w:lvlText w:val=""/>
+      <w:lvlJc w:val="left"/>
+      <w:pPr>
+        <w:tabs>
+          <w:tab w:val="num" w:pos="2160"/>
+        </w:tabs>
+        <w:ind w:left="2160" w:hanging="360"/>
+      </w:pPr>
+      <w:rPr>
+        <w:rFonts w:ascii="Wingdings" w:hAnsi="Wingdings" w:hint="default"/>
+        <w:sz w:val="20"/>
+      </w:rPr>
+    </w:lvl>
+    <w:lvl w:ilvl="3" w:tentative="1">
+      <w:start w:val="1"/>
+      <w:numFmt w:val="bullet"/>
+      <w:lvlText w:val=""/>
+      <w:lvlJc w:val="left"/>
+      <w:pPr>
+        <w:tabs>
+          <w:tab w:val="num" w:pos="2880"/>
+        </w:tabs>
+        <w:ind w:left="2880" w:hanging="360"/>
+      </w:pPr>
+      <w:rPr>
+        <w:rFonts w:ascii="Wingdings" w:hAnsi="Wingdings" w:hint="default"/>
+        <w:sz w:val="20"/>
+      </w:rPr>
+    </w:lvl>
+    <w:lvl w:ilvl="4" w:tentative="1">
+      <w:start w:val="1"/>
+      <w:numFmt w:val="bullet"/>
+      <w:lvlText w:val=""/>
+      <w:lvlJc w:val="left"/>
+      <w:pPr>
+        <w:tabs>
+          <w:tab w:val="num" w:pos="3600"/>
+        </w:tabs>
+        <w:ind w:left="3600" w:hanging="360"/>
+      </w:pPr>
+      <w:rPr>
+        <w:rFonts w:ascii="Wingdings" w:hAnsi="Wingdings" w:hint="default"/>
+        <w:sz w:val="20"/>
+      </w:rPr>
+    </w:lvl>
+    <w:lvl w:ilvl="5" w:tentative="1">
+      <w:start w:val="1"/>
+      <w:numFmt w:val="bullet"/>
+      <w:lvlText w:val=""/>
+      <w:lvlJc w:val="left"/>
+      <w:pPr>
+        <w:tabs>
+          <w:tab w:val="num" w:pos="4320"/>
+        </w:tabs>
+        <w:ind w:left="4320" w:hanging="360"/>
+      </w:pPr>
+      <w:rPr>
+        <w:rFonts w:ascii="Wingdings" w:hAnsi="Wingdings" w:hint="default"/>
+        <w:sz w:val="20"/>
+      </w:rPr>
+    </w:lvl>
+    <w:lvl w:ilvl="6" w:tentative="1">
+      <w:start w:val="1"/>
+      <w:numFmt w:val="bullet"/>
+      <w:lvlText w:val=""/>
+      <w:lvlJc w:val="left"/>
+      <w:pPr>
+        <w:tabs>
+          <w:tab w:val="num" w:pos="5040"/>
+        </w:tabs>
+        <w:ind w:left="5040" w:hanging="360"/>
+      </w:pPr>
+      <w:rPr>
+        <w:rFonts w:ascii="Wingdings" w:hAnsi="Wingdings" w:hint="default"/>
+        <w:sz w:val="20"/>
+      </w:rPr>
+    </w:lvl>
+    <w:lvl w:ilvl="7" w:tentative="1">
+      <w:start w:val="1"/>
+      <w:numFmt w:val="bullet"/>
+      <w:lvlText w:val=""/>
+      <w:lvlJc w:val="left"/>
+      <w:pPr>
+        <w:tabs>
+          <w:tab w:val="num" w:pos="5760"/>
+        </w:tabs>
+        <w:ind w:left="5760" w:hanging="360"/>
+      </w:pPr>
+      <w:rPr>
+        <w:rFonts w:ascii="Wingdings" w:hAnsi="Wingdings" w:hint="default"/>
+        <w:sz w:val="20"/>
+      </w:rPr>
+    </w:lvl>
+    <w:lvl w:ilvl="8" w:tentative="1">
+      <w:start w:val="1"/>
+      <w:numFmt w:val="bullet"/>
+      <w:lvlText w:val=""/>
+      <w:lvlJc w:val="left"/>
+      <w:pPr>
+        <w:tabs>
+          <w:tab w:val="num" w:pos="6480"/>
+        </w:tabs>
+        <w:ind w:left="6480" w:hanging="360"/>
+      </w:pPr>
+      <w:rPr>
+        <w:rFonts w:ascii="Wingdings" w:hAnsi="Wingdings" w:hint="default"/>
+        <w:sz w:val="20"/>
+      </w:rPr>
+    </w:lvl>
+  </w:abstractNum>
+  <w:abstractNum w:abstractNumId="6" w15:restartNumberingAfterBreak="0">
     <w:nsid w:val="0F62514C"/>
     <w:multiLevelType w:val="multilevel"/>
     <w:tmpl w:val="151C1808"/>
@@ -2129,7 +4193,7 @@
       </w:rPr>
     </w:lvl>
   </w:abstractNum>
-  <w:abstractNum w:abstractNumId="4" w15:restartNumberingAfterBreak="0">
+  <w:abstractNum w:abstractNumId="7" w15:restartNumberingAfterBreak="0">
     <w:nsid w:val="10844654"/>
     <w:multiLevelType w:val="multilevel"/>
     <w:tmpl w:val="9286AA2A"/>
@@ -2278,7 +4342,156 @@
       </w:rPr>
     </w:lvl>
   </w:abstractNum>
-  <w:abstractNum w:abstractNumId="5" w15:restartNumberingAfterBreak="0">
+  <w:abstractNum w:abstractNumId="8" w15:restartNumberingAfterBreak="0">
+    <w:nsid w:val="13AF631A"/>
+    <w:multiLevelType w:val="multilevel"/>
+    <w:tmpl w:val="2D3A7DDC"/>
+    <w:lvl w:ilvl="0">
+      <w:start w:val="1"/>
+      <w:numFmt w:val="bullet"/>
+      <w:lvlText w:val=""/>
+      <w:lvlJc w:val="left"/>
+      <w:pPr>
+        <w:tabs>
+          <w:tab w:val="num" w:pos="720"/>
+        </w:tabs>
+        <w:ind w:left="720" w:hanging="360"/>
+      </w:pPr>
+      <w:rPr>
+        <w:rFonts w:ascii="Symbol" w:hAnsi="Symbol" w:hint="default"/>
+        <w:sz w:val="20"/>
+      </w:rPr>
+    </w:lvl>
+    <w:lvl w:ilvl="1" w:tentative="1">
+      <w:start w:val="1"/>
+      <w:numFmt w:val="bullet"/>
+      <w:lvlText w:val="o"/>
+      <w:lvlJc w:val="left"/>
+      <w:pPr>
+        <w:tabs>
+          <w:tab w:val="num" w:pos="1440"/>
+        </w:tabs>
+        <w:ind w:left="1440" w:hanging="360"/>
+      </w:pPr>
+      <w:rPr>
+        <w:rFonts w:ascii="Courier New" w:hAnsi="Courier New" w:hint="default"/>
+        <w:sz w:val="20"/>
+      </w:rPr>
+    </w:lvl>
+    <w:lvl w:ilvl="2" w:tentative="1">
+      <w:start w:val="1"/>
+      <w:numFmt w:val="bullet"/>
+      <w:lvlText w:val=""/>
+      <w:lvlJc w:val="left"/>
+      <w:pPr>
+        <w:tabs>
+          <w:tab w:val="num" w:pos="2160"/>
+        </w:tabs>
+        <w:ind w:left="2160" w:hanging="360"/>
+      </w:pPr>
+      <w:rPr>
+        <w:rFonts w:ascii="Wingdings" w:hAnsi="Wingdings" w:hint="default"/>
+        <w:sz w:val="20"/>
+      </w:rPr>
+    </w:lvl>
+    <w:lvl w:ilvl="3" w:tentative="1">
+      <w:start w:val="1"/>
+      <w:numFmt w:val="bullet"/>
+      <w:lvlText w:val=""/>
+      <w:lvlJc w:val="left"/>
+      <w:pPr>
+        <w:tabs>
+          <w:tab w:val="num" w:pos="2880"/>
+        </w:tabs>
+        <w:ind w:left="2880" w:hanging="360"/>
+      </w:pPr>
+      <w:rPr>
+        <w:rFonts w:ascii="Wingdings" w:hAnsi="Wingdings" w:hint="default"/>
+        <w:sz w:val="20"/>
+      </w:rPr>
+    </w:lvl>
+    <w:lvl w:ilvl="4" w:tentative="1">
+      <w:start w:val="1"/>
+      <w:numFmt w:val="bullet"/>
+      <w:lvlText w:val=""/>
+      <w:lvlJc w:val="left"/>
+      <w:pPr>
+        <w:tabs>
+          <w:tab w:val="num" w:pos="3600"/>
+        </w:tabs>
+        <w:ind w:left="3600" w:hanging="360"/>
+      </w:pPr>
+      <w:rPr>
+        <w:rFonts w:ascii="Wingdings" w:hAnsi="Wingdings" w:hint="default"/>
+        <w:sz w:val="20"/>
+      </w:rPr>
+    </w:lvl>
+    <w:lvl w:ilvl="5" w:tentative="1">
+      <w:start w:val="1"/>
+      <w:numFmt w:val="bullet"/>
+      <w:lvlText w:val=""/>
+      <w:lvlJc w:val="left"/>
+      <w:pPr>
+        <w:tabs>
+          <w:tab w:val="num" w:pos="4320"/>
+        </w:tabs>
+        <w:ind w:left="4320" w:hanging="360"/>
+      </w:pPr>
+      <w:rPr>
+        <w:rFonts w:ascii="Wingdings" w:hAnsi="Wingdings" w:hint="default"/>
+        <w:sz w:val="20"/>
+      </w:rPr>
+    </w:lvl>
+    <w:lvl w:ilvl="6" w:tentative="1">
+      <w:start w:val="1"/>
+      <w:numFmt w:val="bullet"/>
+      <w:lvlText w:val=""/>
+      <w:lvlJc w:val="left"/>
+      <w:pPr>
+        <w:tabs>
+          <w:tab w:val="num" w:pos="5040"/>
+        </w:tabs>
+        <w:ind w:left="5040" w:hanging="360"/>
+      </w:pPr>
+      <w:rPr>
+        <w:rFonts w:ascii="Wingdings" w:hAnsi="Wingdings" w:hint="default"/>
+        <w:sz w:val="20"/>
+      </w:rPr>
+    </w:lvl>
+    <w:lvl w:ilvl="7" w:tentative="1">
+      <w:start w:val="1"/>
+      <w:numFmt w:val="bullet"/>
+      <w:lvlText w:val=""/>
+      <w:lvlJc w:val="left"/>
+      <w:pPr>
+        <w:tabs>
+          <w:tab w:val="num" w:pos="5760"/>
+        </w:tabs>
+        <w:ind w:left="5760" w:hanging="360"/>
+      </w:pPr>
+      <w:rPr>
+        <w:rFonts w:ascii="Wingdings" w:hAnsi="Wingdings" w:hint="default"/>
+        <w:sz w:val="20"/>
+      </w:rPr>
+    </w:lvl>
+    <w:lvl w:ilvl="8" w:tentative="1">
+      <w:start w:val="1"/>
+      <w:numFmt w:val="bullet"/>
+      <w:lvlText w:val=""/>
+      <w:lvlJc w:val="left"/>
+      <w:pPr>
+        <w:tabs>
+          <w:tab w:val="num" w:pos="6480"/>
+        </w:tabs>
+        <w:ind w:left="6480" w:hanging="360"/>
+      </w:pPr>
+      <w:rPr>
+        <w:rFonts w:ascii="Wingdings" w:hAnsi="Wingdings" w:hint="default"/>
+        <w:sz w:val="20"/>
+      </w:rPr>
+    </w:lvl>
+  </w:abstractNum>
+  <w:abstractNum w:abstractNumId="9" w15:restartNumberingAfterBreak="0">
     <w:nsid w:val="14B7635D"/>
     <w:multiLevelType w:val="multilevel"/>
     <w:tmpl w:val="6A8AA976"/>
@@ -2427,7 +4640,305 @@
       </w:rPr>
     </w:lvl>
   </w:abstractNum>
-  <w:abstractNum w:abstractNumId="6" w15:restartNumberingAfterBreak="0">
+  <w:abstractNum w:abstractNumId="10" w15:restartNumberingAfterBreak="0">
+    <w:nsid w:val="22931BA0"/>
+    <w:multiLevelType w:val="multilevel"/>
+    <w:tmpl w:val="0B3EBC42"/>
+    <w:lvl w:ilvl="0">
+      <w:start w:val="1"/>
+      <w:numFmt w:val="bullet"/>
+      <w:lvlText w:val=""/>
+      <w:lvlJc w:val="left"/>
+      <w:pPr>
+        <w:tabs>
+          <w:tab w:val="num" w:pos="720"/>
+        </w:tabs>
+        <w:ind w:left="720" w:hanging="360"/>
+      </w:pPr>
+      <w:rPr>
+        <w:rFonts w:ascii="Symbol" w:hAnsi="Symbol" w:hint="default"/>
+        <w:sz w:val="20"/>
+      </w:rPr>
+    </w:lvl>
+    <w:lvl w:ilvl="1">
+      <w:start w:val="1"/>
+      <w:numFmt w:val="bullet"/>
+      <w:lvlText w:val="o"/>
+      <w:lvlJc w:val="left"/>
+      <w:pPr>
+        <w:tabs>
+          <w:tab w:val="num" w:pos="1440"/>
+        </w:tabs>
+        <w:ind w:left="1440" w:hanging="360"/>
+      </w:pPr>
+      <w:rPr>
+        <w:rFonts w:ascii="Courier New" w:hAnsi="Courier New" w:hint="default"/>
+        <w:sz w:val="20"/>
+      </w:rPr>
+    </w:lvl>
+    <w:lvl w:ilvl="2" w:tentative="1">
+      <w:start w:val="1"/>
+      <w:numFmt w:val="bullet"/>
+      <w:lvlText w:val=""/>
+      <w:lvlJc w:val="left"/>
+      <w:pPr>
+        <w:tabs>
+          <w:tab w:val="num" w:pos="2160"/>
+        </w:tabs>
+        <w:ind w:left="2160" w:hanging="360"/>
+      </w:pPr>
+      <w:rPr>
+        <w:rFonts w:ascii="Wingdings" w:hAnsi="Wingdings" w:hint="default"/>
+        <w:sz w:val="20"/>
+      </w:rPr>
+    </w:lvl>
+    <w:lvl w:ilvl="3" w:tentative="1">
+      <w:start w:val="1"/>
+      <w:numFmt w:val="bullet"/>
+      <w:lvlText w:val=""/>
+      <w:lvlJc w:val="left"/>
+      <w:pPr>
+        <w:tabs>
+          <w:tab w:val="num" w:pos="2880"/>
+        </w:tabs>
+        <w:ind w:left="2880" w:hanging="360"/>
+      </w:pPr>
+      <w:rPr>
+        <w:rFonts w:ascii="Wingdings" w:hAnsi="Wingdings" w:hint="default"/>
+        <w:sz w:val="20"/>
+      </w:rPr>
+    </w:lvl>
+    <w:lvl w:ilvl="4" w:tentative="1">
+      <w:start w:val="1"/>
+      <w:numFmt w:val="bullet"/>
+      <w:lvlText w:val=""/>
+      <w:lvlJc w:val="left"/>
+      <w:pPr>
+        <w:tabs>
+          <w:tab w:val="num" w:pos="3600"/>
+        </w:tabs>
+        <w:ind w:left="3600" w:hanging="360"/>
+      </w:pPr>
+      <w:rPr>
+        <w:rFonts w:ascii="Wingdings" w:hAnsi="Wingdings" w:hint="default"/>
+        <w:sz w:val="20"/>
+      </w:rPr>
+    </w:lvl>
+    <w:lvl w:ilvl="5" w:tentative="1">
+      <w:start w:val="1"/>
+      <w:numFmt w:val="bullet"/>
+      <w:lvlText w:val=""/>
+      <w:lvlJc w:val="left"/>
+      <w:pPr>
+        <w:tabs>
+          <w:tab w:val="num" w:pos="4320"/>
+        </w:tabs>
+        <w:ind w:left="4320" w:hanging="360"/>
+      </w:pPr>
+      <w:rPr>
+        <w:rFonts w:ascii="Wingdings" w:hAnsi="Wingdings" w:hint="default"/>
+        <w:sz w:val="20"/>
+      </w:rPr>
+    </w:lvl>
+    <w:lvl w:ilvl="6" w:tentative="1">
+      <w:start w:val="1"/>
+      <w:numFmt w:val="bullet"/>
+      <w:lvlText w:val=""/>
+      <w:lvlJc w:val="left"/>
+      <w:pPr>
+        <w:tabs>
+          <w:tab w:val="num" w:pos="5040"/>
+        </w:tabs>
+        <w:ind w:left="5040" w:hanging="360"/>
+      </w:pPr>
+      <w:rPr>
+        <w:rFonts w:ascii="Wingdings" w:hAnsi="Wingdings" w:hint="default"/>
+        <w:sz w:val="20"/>
+      </w:rPr>
+    </w:lvl>
+    <w:lvl w:ilvl="7" w:tentative="1">
+      <w:start w:val="1"/>
+      <w:numFmt w:val="bullet"/>
+      <w:lvlText w:val=""/>
+      <w:lvlJc w:val="left"/>
+      <w:pPr>
+        <w:tabs>
+          <w:tab w:val="num" w:pos="5760"/>
+        </w:tabs>
+        <w:ind w:left="5760" w:hanging="360"/>
+      </w:pPr>
+      <w:rPr>
+        <w:rFonts w:ascii="Wingdings" w:hAnsi="Wingdings" w:hint="default"/>
+        <w:sz w:val="20"/>
+      </w:rPr>
+    </w:lvl>
+    <w:lvl w:ilvl="8" w:tentative="1">
+      <w:start w:val="1"/>
+      <w:numFmt w:val="bullet"/>
+      <w:lvlText w:val=""/>
+      <w:lvlJc w:val="left"/>
+      <w:pPr>
+        <w:tabs>
+          <w:tab w:val="num" w:pos="6480"/>
+        </w:tabs>
+        <w:ind w:left="6480" w:hanging="360"/>
+      </w:pPr>
+      <w:rPr>
+        <w:rFonts w:ascii="Wingdings" w:hAnsi="Wingdings" w:hint="default"/>
+        <w:sz w:val="20"/>
+      </w:rPr>
+    </w:lvl>
+  </w:abstractNum>
+  <w:abstractNum w:abstractNumId="11" w15:restartNumberingAfterBreak="0">
+    <w:nsid w:val="2B405F47"/>
+    <w:multiLevelType w:val="multilevel"/>
+    <w:tmpl w:val="F4283658"/>
+    <w:lvl w:ilvl="0">
+      <w:start w:val="1"/>
+      <w:numFmt w:val="bullet"/>
+      <w:lvlText w:val=""/>
+      <w:lvlJc w:val="left"/>
+      <w:pPr>
+        <w:tabs>
+          <w:tab w:val="num" w:pos="720"/>
+        </w:tabs>
+        <w:ind w:left="720" w:hanging="360"/>
+      </w:pPr>
+      <w:rPr>
+        <w:rFonts w:ascii="Symbol" w:hAnsi="Symbol" w:hint="default"/>
+        <w:sz w:val="20"/>
+      </w:rPr>
+    </w:lvl>
+    <w:lvl w:ilvl="1" w:tentative="1">
+      <w:start w:val="1"/>
+      <w:numFmt w:val="bullet"/>
+      <w:lvlText w:val="o"/>
+      <w:lvlJc w:val="left"/>
+      <w:pPr>
+        <w:tabs>
+          <w:tab w:val="num" w:pos="1440"/>
+        </w:tabs>
+        <w:ind w:left="1440" w:hanging="360"/>
+      </w:pPr>
+      <w:rPr>
+        <w:rFonts w:ascii="Courier New" w:hAnsi="Courier New" w:hint="default"/>
+        <w:sz w:val="20"/>
+      </w:rPr>
+    </w:lvl>
+    <w:lvl w:ilvl="2" w:tentative="1">
+      <w:start w:val="1"/>
+      <w:numFmt w:val="bullet"/>
+      <w:lvlText w:val=""/>
+      <w:lvlJc w:val="left"/>
+      <w:pPr>
+        <w:tabs>
+          <w:tab w:val="num" w:pos="2160"/>
+        </w:tabs>
+        <w:ind w:left="2160" w:hanging="360"/>
+      </w:pPr>
+      <w:rPr>
+        <w:rFonts w:ascii="Wingdings" w:hAnsi="Wingdings" w:hint="default"/>
+        <w:sz w:val="20"/>
+      </w:rPr>
+    </w:lvl>
+    <w:lvl w:ilvl="3" w:tentative="1">
+      <w:start w:val="1"/>
+      <w:numFmt w:val="bullet"/>
+      <w:lvlText w:val=""/>
+      <w:lvlJc w:val="left"/>
+      <w:pPr>
+        <w:tabs>
+          <w:tab w:val="num" w:pos="2880"/>
+        </w:tabs>
+        <w:ind w:left="2880" w:hanging="360"/>
+      </w:pPr>
+      <w:rPr>
+        <w:rFonts w:ascii="Wingdings" w:hAnsi="Wingdings" w:hint="default"/>
+        <w:sz w:val="20"/>
+      </w:rPr>
+    </w:lvl>
+    <w:lvl w:ilvl="4" w:tentative="1">
+      <w:start w:val="1"/>
+      <w:numFmt w:val="bullet"/>
+      <w:lvlText w:val=""/>
+      <w:lvlJc w:val="left"/>
+      <w:pPr>
+        <w:tabs>
+          <w:tab w:val="num" w:pos="3600"/>
+        </w:tabs>
+        <w:ind w:left="3600" w:hanging="360"/>
+      </w:pPr>
+      <w:rPr>
+        <w:rFonts w:ascii="Wingdings" w:hAnsi="Wingdings" w:hint="default"/>
+        <w:sz w:val="20"/>
+      </w:rPr>
+    </w:lvl>
+    <w:lvl w:ilvl="5" w:tentative="1">
+      <w:start w:val="1"/>
+      <w:numFmt w:val="bullet"/>
+      <w:lvlText w:val=""/>
+      <w:lvlJc w:val="left"/>
+      <w:pPr>
+        <w:tabs>
+          <w:tab w:val="num" w:pos="4320"/>
+        </w:tabs>
+        <w:ind w:left="4320" w:hanging="360"/>
+      </w:pPr>
+      <w:rPr>
+        <w:rFonts w:ascii="Wingdings" w:hAnsi="Wingdings" w:hint="default"/>
+        <w:sz w:val="20"/>
+      </w:rPr>
+    </w:lvl>
+    <w:lvl w:ilvl="6" w:tentative="1">
+      <w:start w:val="1"/>
+      <w:numFmt w:val="bullet"/>
+      <w:lvlText w:val=""/>
+      <w:lvlJc w:val="left"/>
+      <w:pPr>
+        <w:tabs>
+          <w:tab w:val="num" w:pos="5040"/>
+        </w:tabs>
+        <w:ind w:left="5040" w:hanging="360"/>
+      </w:pPr>
+      <w:rPr>
+        <w:rFonts w:ascii="Wingdings" w:hAnsi="Wingdings" w:hint="default"/>
+        <w:sz w:val="20"/>
+      </w:rPr>
+    </w:lvl>
+    <w:lvl w:ilvl="7" w:tentative="1">
+      <w:start w:val="1"/>
+      <w:numFmt w:val="bullet"/>
+      <w:lvlText w:val=""/>
+      <w:lvlJc w:val="left"/>
+      <w:pPr>
+        <w:tabs>
+          <w:tab w:val="num" w:pos="5760"/>
+        </w:tabs>
+        <w:ind w:left="5760" w:hanging="360"/>
+      </w:pPr>
+      <w:rPr>
+        <w:rFonts w:ascii="Wingdings" w:hAnsi="Wingdings" w:hint="default"/>
+        <w:sz w:val="20"/>
+      </w:rPr>
+    </w:lvl>
+    <w:lvl w:ilvl="8" w:tentative="1">
+      <w:start w:val="1"/>
+      <w:numFmt w:val="bullet"/>
+      <w:lvlText w:val=""/>
+      <w:lvlJc w:val="left"/>
+      <w:pPr>
+        <w:tabs>
+          <w:tab w:val="num" w:pos="6480"/>
+        </w:tabs>
+        <w:ind w:left="6480" w:hanging="360"/>
+      </w:pPr>
+      <w:rPr>
+        <w:rFonts w:ascii="Wingdings" w:hAnsi="Wingdings" w:hint="default"/>
+        <w:sz w:val="20"/>
+      </w:rPr>
+    </w:lvl>
+  </w:abstractNum>
+  <w:abstractNum w:abstractNumId="12" w15:restartNumberingAfterBreak="0">
     <w:nsid w:val="2FA57BC9"/>
     <w:multiLevelType w:val="multilevel"/>
     <w:tmpl w:val="262A7422"/>
@@ -2576,7 +5087,7 @@
       </w:rPr>
     </w:lvl>
   </w:abstractNum>
-  <w:abstractNum w:abstractNumId="7" w15:restartNumberingAfterBreak="0">
+  <w:abstractNum w:abstractNumId="13" w15:restartNumberingAfterBreak="0">
     <w:nsid w:val="31D20618"/>
     <w:multiLevelType w:val="multilevel"/>
     <w:tmpl w:val="0B228790"/>
@@ -2725,7 +5236,156 @@
       </w:rPr>
     </w:lvl>
   </w:abstractNum>
-  <w:abstractNum w:abstractNumId="8" w15:restartNumberingAfterBreak="0">
+  <w:abstractNum w:abstractNumId="14" w15:restartNumberingAfterBreak="0">
+    <w:nsid w:val="337D0527"/>
+    <w:multiLevelType w:val="multilevel"/>
+    <w:tmpl w:val="BE6EF62E"/>
+    <w:lvl w:ilvl="0">
+      <w:start w:val="1"/>
+      <w:numFmt w:val="bullet"/>
+      <w:lvlText w:val=""/>
+      <w:lvlJc w:val="left"/>
+      <w:pPr>
+        <w:tabs>
+          <w:tab w:val="num" w:pos="720"/>
+        </w:tabs>
+        <w:ind w:left="720" w:hanging="360"/>
+      </w:pPr>
+      <w:rPr>
+        <w:rFonts w:ascii="Symbol" w:hAnsi="Symbol" w:hint="default"/>
+        <w:sz w:val="20"/>
+      </w:rPr>
+    </w:lvl>
+    <w:lvl w:ilvl="1">
+      <w:start w:val="1"/>
+      <w:numFmt w:val="bullet"/>
+      <w:lvlText w:val="o"/>
+      <w:lvlJc w:val="left"/>
+      <w:pPr>
+        <w:tabs>
+          <w:tab w:val="num" w:pos="1440"/>
+        </w:tabs>
+        <w:ind w:left="1440" w:hanging="360"/>
+      </w:pPr>
+      <w:rPr>
+        <w:rFonts w:ascii="Courier New" w:hAnsi="Courier New" w:hint="default"/>
+        <w:sz w:val="20"/>
+      </w:rPr>
+    </w:lvl>
+    <w:lvl w:ilvl="2" w:tentative="1">
+      <w:start w:val="1"/>
+      <w:numFmt w:val="bullet"/>
+      <w:lvlText w:val=""/>
+      <w:lvlJc w:val="left"/>
+      <w:pPr>
+        <w:tabs>
+          <w:tab w:val="num" w:pos="2160"/>
+        </w:tabs>
+        <w:ind w:left="2160" w:hanging="360"/>
+      </w:pPr>
+      <w:rPr>
+        <w:rFonts w:ascii="Wingdings" w:hAnsi="Wingdings" w:hint="default"/>
+        <w:sz w:val="20"/>
+      </w:rPr>
+    </w:lvl>
+    <w:lvl w:ilvl="3" w:tentative="1">
+      <w:start w:val="1"/>
+      <w:numFmt w:val="bullet"/>
+      <w:lvlText w:val=""/>
+      <w:lvlJc w:val="left"/>
+      <w:pPr>
+        <w:tabs>
+          <w:tab w:val="num" w:pos="2880"/>
+        </w:tabs>
+        <w:ind w:left="2880" w:hanging="360"/>
+      </w:pPr>
+      <w:rPr>
+        <w:rFonts w:ascii="Wingdings" w:hAnsi="Wingdings" w:hint="default"/>
+        <w:sz w:val="20"/>
+      </w:rPr>
+    </w:lvl>
+    <w:lvl w:ilvl="4" w:tentative="1">
+      <w:start w:val="1"/>
+      <w:numFmt w:val="bullet"/>
+      <w:lvlText w:val=""/>
+      <w:lvlJc w:val="left"/>
+      <w:pPr>
+        <w:tabs>
+          <w:tab w:val="num" w:pos="3600"/>
+        </w:tabs>
+        <w:ind w:left="3600" w:hanging="360"/>
+      </w:pPr>
+      <w:rPr>
+        <w:rFonts w:ascii="Wingdings" w:hAnsi="Wingdings" w:hint="default"/>
+        <w:sz w:val="20"/>
+      </w:rPr>
+    </w:lvl>
+    <w:lvl w:ilvl="5" w:tentative="1">
+      <w:start w:val="1"/>
+      <w:numFmt w:val="bullet"/>
+      <w:lvlText w:val=""/>
+      <w:lvlJc w:val="left"/>
+      <w:pPr>
+        <w:tabs>
+          <w:tab w:val="num" w:pos="4320"/>
+        </w:tabs>
+        <w:ind w:left="4320" w:hanging="360"/>
+      </w:pPr>
+      <w:rPr>
+        <w:rFonts w:ascii="Wingdings" w:hAnsi="Wingdings" w:hint="default"/>
+        <w:sz w:val="20"/>
+      </w:rPr>
+    </w:lvl>
+    <w:lvl w:ilvl="6" w:tentative="1">
+      <w:start w:val="1"/>
+      <w:numFmt w:val="bullet"/>
+      <w:lvlText w:val=""/>
+      <w:lvlJc w:val="left"/>
+      <w:pPr>
+        <w:tabs>
+          <w:tab w:val="num" w:pos="5040"/>
+        </w:tabs>
+        <w:ind w:left="5040" w:hanging="360"/>
+      </w:pPr>
+      <w:rPr>
+        <w:rFonts w:ascii="Wingdings" w:hAnsi="Wingdings" w:hint="default"/>
+        <w:sz w:val="20"/>
+      </w:rPr>
+    </w:lvl>
+    <w:lvl w:ilvl="7" w:tentative="1">
+      <w:start w:val="1"/>
+      <w:numFmt w:val="bullet"/>
+      <w:lvlText w:val=""/>
+      <w:lvlJc w:val="left"/>
+      <w:pPr>
+        <w:tabs>
+          <w:tab w:val="num" w:pos="5760"/>
+        </w:tabs>
+        <w:ind w:left="5760" w:hanging="360"/>
+      </w:pPr>
+      <w:rPr>
+        <w:rFonts w:ascii="Wingdings" w:hAnsi="Wingdings" w:hint="default"/>
+        <w:sz w:val="20"/>
+      </w:rPr>
+    </w:lvl>
+    <w:lvl w:ilvl="8" w:tentative="1">
+      <w:start w:val="1"/>
+      <w:numFmt w:val="bullet"/>
+      <w:lvlText w:val=""/>
+      <w:lvlJc w:val="left"/>
+      <w:pPr>
+        <w:tabs>
+          <w:tab w:val="num" w:pos="6480"/>
+        </w:tabs>
+        <w:ind w:left="6480" w:hanging="360"/>
+      </w:pPr>
+      <w:rPr>
+        <w:rFonts w:ascii="Wingdings" w:hAnsi="Wingdings" w:hint="default"/>
+        <w:sz w:val="20"/>
+      </w:rPr>
+    </w:lvl>
+  </w:abstractNum>
+  <w:abstractNum w:abstractNumId="15" w15:restartNumberingAfterBreak="0">
     <w:nsid w:val="399E0F6D"/>
     <w:multiLevelType w:val="multilevel"/>
     <w:tmpl w:val="EC90E5D8"/>
@@ -2874,7 +5534,7 @@
       </w:rPr>
     </w:lvl>
   </w:abstractNum>
-  <w:abstractNum w:abstractNumId="9" w15:restartNumberingAfterBreak="0">
+  <w:abstractNum w:abstractNumId="16" w15:restartNumberingAfterBreak="0">
     <w:nsid w:val="3BBB2E4B"/>
     <w:multiLevelType w:val="multilevel"/>
     <w:tmpl w:val="442CA682"/>
@@ -3023,7 +5683,7 @@
       </w:rPr>
     </w:lvl>
   </w:abstractNum>
-  <w:abstractNum w:abstractNumId="10" w15:restartNumberingAfterBreak="0">
+  <w:abstractNum w:abstractNumId="17" w15:restartNumberingAfterBreak="0">
     <w:nsid w:val="3FE1599A"/>
     <w:multiLevelType w:val="multilevel"/>
     <w:tmpl w:val="48BE2BFC"/>
@@ -3172,7 +5832,7 @@
       </w:rPr>
     </w:lvl>
   </w:abstractNum>
-  <w:abstractNum w:abstractNumId="11" w15:restartNumberingAfterBreak="0">
+  <w:abstractNum w:abstractNumId="18" w15:restartNumberingAfterBreak="0">
     <w:nsid w:val="440373EE"/>
     <w:multiLevelType w:val="multilevel"/>
     <w:tmpl w:val="A77E3F46"/>
@@ -3321,7 +5981,567 @@
       </w:rPr>
     </w:lvl>
   </w:abstractNum>
-  <w:abstractNum w:abstractNumId="12" w15:restartNumberingAfterBreak="0">
+  <w:abstractNum w:abstractNumId="19" w15:restartNumberingAfterBreak="0">
+    <w:nsid w:val="474C7603"/>
+    <w:multiLevelType w:val="multilevel"/>
+    <w:tmpl w:val="29B0C45A"/>
+    <w:lvl w:ilvl="0">
+      <w:start w:val="1"/>
+      <w:numFmt w:val="bullet"/>
+      <w:lvlText w:val=""/>
+      <w:lvlJc w:val="left"/>
+      <w:pPr>
+        <w:tabs>
+          <w:tab w:val="num" w:pos="720"/>
+        </w:tabs>
+        <w:ind w:left="720" w:hanging="360"/>
+      </w:pPr>
+      <w:rPr>
+        <w:rFonts w:ascii="Symbol" w:hAnsi="Symbol" w:hint="default"/>
+        <w:sz w:val="20"/>
+      </w:rPr>
+    </w:lvl>
+    <w:lvl w:ilvl="1">
+      <w:start w:val="1"/>
+      <w:numFmt w:val="bullet"/>
+      <w:lvlText w:val="o"/>
+      <w:lvlJc w:val="left"/>
+      <w:pPr>
+        <w:tabs>
+          <w:tab w:val="num" w:pos="1440"/>
+        </w:tabs>
+        <w:ind w:left="1440" w:hanging="360"/>
+      </w:pPr>
+      <w:rPr>
+        <w:rFonts w:ascii="Courier New" w:hAnsi="Courier New" w:hint="default"/>
+        <w:sz w:val="20"/>
+      </w:rPr>
+    </w:lvl>
+    <w:lvl w:ilvl="2" w:tentative="1">
+      <w:start w:val="1"/>
+      <w:numFmt w:val="bullet"/>
+      <w:lvlText w:val=""/>
+      <w:lvlJc w:val="left"/>
+      <w:pPr>
+        <w:tabs>
+          <w:tab w:val="num" w:pos="2160"/>
+        </w:tabs>
+        <w:ind w:left="2160" w:hanging="360"/>
+      </w:pPr>
+      <w:rPr>
+        <w:rFonts w:ascii="Wingdings" w:hAnsi="Wingdings" w:hint="default"/>
+        <w:sz w:val="20"/>
+      </w:rPr>
+    </w:lvl>
+    <w:lvl w:ilvl="3" w:tentative="1">
+      <w:start w:val="1"/>
+      <w:numFmt w:val="bullet"/>
+      <w:lvlText w:val=""/>
+      <w:lvlJc w:val="left"/>
+      <w:pPr>
+        <w:tabs>
+          <w:tab w:val="num" w:pos="2880"/>
+        </w:tabs>
+        <w:ind w:left="2880" w:hanging="360"/>
+      </w:pPr>
+      <w:rPr>
+        <w:rFonts w:ascii="Wingdings" w:hAnsi="Wingdings" w:hint="default"/>
+        <w:sz w:val="20"/>
+      </w:rPr>
+    </w:lvl>
+    <w:lvl w:ilvl="4" w:tentative="1">
+      <w:start w:val="1"/>
+      <w:numFmt w:val="bullet"/>
+      <w:lvlText w:val=""/>
+      <w:lvlJc w:val="left"/>
+      <w:pPr>
+        <w:tabs>
+          <w:tab w:val="num" w:pos="3600"/>
+        </w:tabs>
+        <w:ind w:left="3600" w:hanging="360"/>
+      </w:pPr>
+      <w:rPr>
+        <w:rFonts w:ascii="Wingdings" w:hAnsi="Wingdings" w:hint="default"/>
+        <w:sz w:val="20"/>
+      </w:rPr>
+    </w:lvl>
+    <w:lvl w:ilvl="5" w:tentative="1">
+      <w:start w:val="1"/>
+      <w:numFmt w:val="bullet"/>
+      <w:lvlText w:val=""/>
+      <w:lvlJc w:val="left"/>
+      <w:pPr>
+        <w:tabs>
+          <w:tab w:val="num" w:pos="4320"/>
+        </w:tabs>
+        <w:ind w:left="4320" w:hanging="360"/>
+      </w:pPr>
+      <w:rPr>
+        <w:rFonts w:ascii="Wingdings" w:hAnsi="Wingdings" w:hint="default"/>
+        <w:sz w:val="20"/>
+      </w:rPr>
+    </w:lvl>
+    <w:lvl w:ilvl="6" w:tentative="1">
+      <w:start w:val="1"/>
+      <w:numFmt w:val="bullet"/>
+      <w:lvlText w:val=""/>
+      <w:lvlJc w:val="left"/>
+      <w:pPr>
+        <w:tabs>
+          <w:tab w:val="num" w:pos="5040"/>
+        </w:tabs>
+        <w:ind w:left="5040" w:hanging="360"/>
+      </w:pPr>
+      <w:rPr>
+        <w:rFonts w:ascii="Wingdings" w:hAnsi="Wingdings" w:hint="default"/>
+        <w:sz w:val="20"/>
+      </w:rPr>
+    </w:lvl>
+    <w:lvl w:ilvl="7" w:tentative="1">
+      <w:start w:val="1"/>
+      <w:numFmt w:val="bullet"/>
+      <w:lvlText w:val=""/>
+      <w:lvlJc w:val="left"/>
+      <w:pPr>
+        <w:tabs>
+          <w:tab w:val="num" w:pos="5760"/>
+        </w:tabs>
+        <w:ind w:left="5760" w:hanging="360"/>
+      </w:pPr>
+      <w:rPr>
+        <w:rFonts w:ascii="Wingdings" w:hAnsi="Wingdings" w:hint="default"/>
+        <w:sz w:val="20"/>
+      </w:rPr>
+    </w:lvl>
+    <w:lvl w:ilvl="8" w:tentative="1">
+      <w:start w:val="1"/>
+      <w:numFmt w:val="bullet"/>
+      <w:lvlText w:val=""/>
+      <w:lvlJc w:val="left"/>
+      <w:pPr>
+        <w:tabs>
+          <w:tab w:val="num" w:pos="6480"/>
+        </w:tabs>
+        <w:ind w:left="6480" w:hanging="360"/>
+      </w:pPr>
+      <w:rPr>
+        <w:rFonts w:ascii="Wingdings" w:hAnsi="Wingdings" w:hint="default"/>
+        <w:sz w:val="20"/>
+      </w:rPr>
+    </w:lvl>
+  </w:abstractNum>
+  <w:abstractNum w:abstractNumId="20" w15:restartNumberingAfterBreak="0">
+    <w:nsid w:val="4AF71A50"/>
+    <w:multiLevelType w:val="multilevel"/>
+    <w:tmpl w:val="33D6025A"/>
+    <w:lvl w:ilvl="0">
+      <w:start w:val="1"/>
+      <w:numFmt w:val="decimal"/>
+      <w:lvlText w:val="%1."/>
+      <w:lvlJc w:val="left"/>
+      <w:pPr>
+        <w:tabs>
+          <w:tab w:val="num" w:pos="720"/>
+        </w:tabs>
+        <w:ind w:left="720" w:hanging="360"/>
+      </w:pPr>
+    </w:lvl>
+    <w:lvl w:ilvl="1" w:tentative="1">
+      <w:start w:val="1"/>
+      <w:numFmt w:val="decimal"/>
+      <w:lvlText w:val="%2."/>
+      <w:lvlJc w:val="left"/>
+      <w:pPr>
+        <w:tabs>
+          <w:tab w:val="num" w:pos="1440"/>
+        </w:tabs>
+        <w:ind w:left="1440" w:hanging="360"/>
+      </w:pPr>
+    </w:lvl>
+    <w:lvl w:ilvl="2" w:tentative="1">
+      <w:start w:val="1"/>
+      <w:numFmt w:val="decimal"/>
+      <w:lvlText w:val="%3."/>
+      <w:lvlJc w:val="left"/>
+      <w:pPr>
+        <w:tabs>
+          <w:tab w:val="num" w:pos="2160"/>
+        </w:tabs>
+        <w:ind w:left="2160" w:hanging="360"/>
+      </w:pPr>
+    </w:lvl>
+    <w:lvl w:ilvl="3" w:tentative="1">
+      <w:start w:val="1"/>
+      <w:numFmt w:val="decimal"/>
+      <w:lvlText w:val="%4."/>
+      <w:lvlJc w:val="left"/>
+      <w:pPr>
+        <w:tabs>
+          <w:tab w:val="num" w:pos="2880"/>
+        </w:tabs>
+        <w:ind w:left="2880" w:hanging="360"/>
+      </w:pPr>
+    </w:lvl>
+    <w:lvl w:ilvl="4" w:tentative="1">
+      <w:start w:val="1"/>
+      <w:numFmt w:val="decimal"/>
+      <w:lvlText w:val="%5."/>
+      <w:lvlJc w:val="left"/>
+      <w:pPr>
+        <w:tabs>
+          <w:tab w:val="num" w:pos="3600"/>
+        </w:tabs>
+        <w:ind w:left="3600" w:hanging="360"/>
+      </w:pPr>
+    </w:lvl>
+    <w:lvl w:ilvl="5" w:tentative="1">
+      <w:start w:val="1"/>
+      <w:numFmt w:val="decimal"/>
+      <w:lvlText w:val="%6."/>
+      <w:lvlJc w:val="left"/>
+      <w:pPr>
+        <w:tabs>
+          <w:tab w:val="num" w:pos="4320"/>
+        </w:tabs>
+        <w:ind w:left="4320" w:hanging="360"/>
+      </w:pPr>
+    </w:lvl>
+    <w:lvl w:ilvl="6" w:tentative="1">
+      <w:start w:val="1"/>
+      <w:numFmt w:val="decimal"/>
+      <w:lvlText w:val="%7."/>
+      <w:lvlJc w:val="left"/>
+      <w:pPr>
+        <w:tabs>
+          <w:tab w:val="num" w:pos="5040"/>
+        </w:tabs>
+        <w:ind w:left="5040" w:hanging="360"/>
+      </w:pPr>
+    </w:lvl>
+    <w:lvl w:ilvl="7" w:tentative="1">
+      <w:start w:val="1"/>
+      <w:numFmt w:val="decimal"/>
+      <w:lvlText w:val="%8."/>
+      <w:lvlJc w:val="left"/>
+      <w:pPr>
+        <w:tabs>
+          <w:tab w:val="num" w:pos="5760"/>
+        </w:tabs>
+        <w:ind w:left="5760" w:hanging="360"/>
+      </w:pPr>
+    </w:lvl>
+    <w:lvl w:ilvl="8" w:tentative="1">
+      <w:start w:val="1"/>
+      <w:numFmt w:val="decimal"/>
+      <w:lvlText w:val="%9."/>
+      <w:lvlJc w:val="left"/>
+      <w:pPr>
+        <w:tabs>
+          <w:tab w:val="num" w:pos="6480"/>
+        </w:tabs>
+        <w:ind w:left="6480" w:hanging="360"/>
+      </w:pPr>
+    </w:lvl>
+  </w:abstractNum>
+  <w:abstractNum w:abstractNumId="21" w15:restartNumberingAfterBreak="0">
+    <w:nsid w:val="52BA6645"/>
+    <w:multiLevelType w:val="multilevel"/>
+    <w:tmpl w:val="6510AC7E"/>
+    <w:lvl w:ilvl="0">
+      <w:start w:val="1"/>
+      <w:numFmt w:val="bullet"/>
+      <w:lvlText w:val=""/>
+      <w:lvlJc w:val="left"/>
+      <w:pPr>
+        <w:tabs>
+          <w:tab w:val="num" w:pos="720"/>
+        </w:tabs>
+        <w:ind w:left="720" w:hanging="360"/>
+      </w:pPr>
+      <w:rPr>
+        <w:rFonts w:ascii="Symbol" w:hAnsi="Symbol" w:hint="default"/>
+        <w:sz w:val="20"/>
+      </w:rPr>
+    </w:lvl>
+    <w:lvl w:ilvl="1" w:tentative="1">
+      <w:start w:val="1"/>
+      <w:numFmt w:val="bullet"/>
+      <w:lvlText w:val="o"/>
+      <w:lvlJc w:val="left"/>
+      <w:pPr>
+        <w:tabs>
+          <w:tab w:val="num" w:pos="1440"/>
+        </w:tabs>
+        <w:ind w:left="1440" w:hanging="360"/>
+      </w:pPr>
+      <w:rPr>
+        <w:rFonts w:ascii="Courier New" w:hAnsi="Courier New" w:hint="default"/>
+        <w:sz w:val="20"/>
+      </w:rPr>
+    </w:lvl>
+    <w:lvl w:ilvl="2" w:tentative="1">
+      <w:start w:val="1"/>
+      <w:numFmt w:val="bullet"/>
+      <w:lvlText w:val=""/>
+      <w:lvlJc w:val="left"/>
+      <w:pPr>
+        <w:tabs>
+          <w:tab w:val="num" w:pos="2160"/>
+        </w:tabs>
+        <w:ind w:left="2160" w:hanging="360"/>
+      </w:pPr>
+      <w:rPr>
+        <w:rFonts w:ascii="Wingdings" w:hAnsi="Wingdings" w:hint="default"/>
+        <w:sz w:val="20"/>
+      </w:rPr>
+    </w:lvl>
+    <w:lvl w:ilvl="3" w:tentative="1">
+      <w:start w:val="1"/>
+      <w:numFmt w:val="bullet"/>
+      <w:lvlText w:val=""/>
+      <w:lvlJc w:val="left"/>
+      <w:pPr>
+        <w:tabs>
+          <w:tab w:val="num" w:pos="2880"/>
+        </w:tabs>
+        <w:ind w:left="2880" w:hanging="360"/>
+      </w:pPr>
+      <w:rPr>
+        <w:rFonts w:ascii="Wingdings" w:hAnsi="Wingdings" w:hint="default"/>
+        <w:sz w:val="20"/>
+      </w:rPr>
+    </w:lvl>
+    <w:lvl w:ilvl="4" w:tentative="1">
+      <w:start w:val="1"/>
+      <w:numFmt w:val="bullet"/>
+      <w:lvlText w:val=""/>
+      <w:lvlJc w:val="left"/>
+      <w:pPr>
+        <w:tabs>
+          <w:tab w:val="num" w:pos="3600"/>
+        </w:tabs>
+        <w:ind w:left="3600" w:hanging="360"/>
+      </w:pPr>
+      <w:rPr>
+        <w:rFonts w:ascii="Wingdings" w:hAnsi="Wingdings" w:hint="default"/>
+        <w:sz w:val="20"/>
+      </w:rPr>
+    </w:lvl>
+    <w:lvl w:ilvl="5" w:tentative="1">
+      <w:start w:val="1"/>
+      <w:numFmt w:val="bullet"/>
+      <w:lvlText w:val=""/>
+      <w:lvlJc w:val="left"/>
+      <w:pPr>
+        <w:tabs>
+          <w:tab w:val="num" w:pos="4320"/>
+        </w:tabs>
+        <w:ind w:left="4320" w:hanging="360"/>
+      </w:pPr>
+      <w:rPr>
+        <w:rFonts w:ascii="Wingdings" w:hAnsi="Wingdings" w:hint="default"/>
+        <w:sz w:val="20"/>
+      </w:rPr>
+    </w:lvl>
+    <w:lvl w:ilvl="6" w:tentative="1">
+      <w:start w:val="1"/>
+      <w:numFmt w:val="bullet"/>
+      <w:lvlText w:val=""/>
+      <w:lvlJc w:val="left"/>
+      <w:pPr>
+        <w:tabs>
+          <w:tab w:val="num" w:pos="5040"/>
+        </w:tabs>
+        <w:ind w:left="5040" w:hanging="360"/>
+      </w:pPr>
+      <w:rPr>
+        <w:rFonts w:ascii="Wingdings" w:hAnsi="Wingdings" w:hint="default"/>
+        <w:sz w:val="20"/>
+      </w:rPr>
+    </w:lvl>
+    <w:lvl w:ilvl="7" w:tentative="1">
+      <w:start w:val="1"/>
+      <w:numFmt w:val="bullet"/>
+      <w:lvlText w:val=""/>
+      <w:lvlJc w:val="left"/>
+      <w:pPr>
+        <w:tabs>
+          <w:tab w:val="num" w:pos="5760"/>
+        </w:tabs>
+        <w:ind w:left="5760" w:hanging="360"/>
+      </w:pPr>
+      <w:rPr>
+        <w:rFonts w:ascii="Wingdings" w:hAnsi="Wingdings" w:hint="default"/>
+        <w:sz w:val="20"/>
+      </w:rPr>
+    </w:lvl>
+    <w:lvl w:ilvl="8" w:tentative="1">
+      <w:start w:val="1"/>
+      <w:numFmt w:val="bullet"/>
+      <w:lvlText w:val=""/>
+      <w:lvlJc w:val="left"/>
+      <w:pPr>
+        <w:tabs>
+          <w:tab w:val="num" w:pos="6480"/>
+        </w:tabs>
+        <w:ind w:left="6480" w:hanging="360"/>
+      </w:pPr>
+      <w:rPr>
+        <w:rFonts w:ascii="Wingdings" w:hAnsi="Wingdings" w:hint="default"/>
+        <w:sz w:val="20"/>
+      </w:rPr>
+    </w:lvl>
+  </w:abstractNum>
+  <w:abstractNum w:abstractNumId="22" w15:restartNumberingAfterBreak="0">
+    <w:nsid w:val="64CB1036"/>
+    <w:multiLevelType w:val="multilevel"/>
+    <w:tmpl w:val="445CCB50"/>
+    <w:lvl w:ilvl="0">
+      <w:start w:val="1"/>
+      <w:numFmt w:val="bullet"/>
+      <w:lvlText w:val=""/>
+      <w:lvlJc w:val="left"/>
+      <w:pPr>
+        <w:tabs>
+          <w:tab w:val="num" w:pos="720"/>
+        </w:tabs>
+        <w:ind w:left="720" w:hanging="360"/>
+      </w:pPr>
+      <w:rPr>
+        <w:rFonts w:ascii="Symbol" w:hAnsi="Symbol" w:hint="default"/>
+        <w:sz w:val="20"/>
+      </w:rPr>
+    </w:lvl>
+    <w:lvl w:ilvl="1" w:tentative="1">
+      <w:start w:val="1"/>
+      <w:numFmt w:val="bullet"/>
+      <w:lvlText w:val="o"/>
+      <w:lvlJc w:val="left"/>
+      <w:pPr>
+        <w:tabs>
+          <w:tab w:val="num" w:pos="1440"/>
+        </w:tabs>
+        <w:ind w:left="1440" w:hanging="360"/>
+      </w:pPr>
+      <w:rPr>
+        <w:rFonts w:ascii="Courier New" w:hAnsi="Courier New" w:hint="default"/>
+        <w:sz w:val="20"/>
+      </w:rPr>
+    </w:lvl>
+    <w:lvl w:ilvl="2" w:tentative="1">
+      <w:start w:val="1"/>
+      <w:numFmt w:val="bullet"/>
+      <w:lvlText w:val=""/>
+      <w:lvlJc w:val="left"/>
+      <w:pPr>
+        <w:tabs>
+          <w:tab w:val="num" w:pos="2160"/>
+        </w:tabs>
+        <w:ind w:left="2160" w:hanging="360"/>
+      </w:pPr>
+      <w:rPr>
+        <w:rFonts w:ascii="Wingdings" w:hAnsi="Wingdings" w:hint="default"/>
+        <w:sz w:val="20"/>
+      </w:rPr>
+    </w:lvl>
+    <w:lvl w:ilvl="3" w:tentative="1">
+      <w:start w:val="1"/>
+      <w:numFmt w:val="bullet"/>
+      <w:lvlText w:val=""/>
+      <w:lvlJc w:val="left"/>
+      <w:pPr>
+        <w:tabs>
+          <w:tab w:val="num" w:pos="2880"/>
+        </w:tabs>
+        <w:ind w:left="2880" w:hanging="360"/>
+      </w:pPr>
+      <w:rPr>
+        <w:rFonts w:ascii="Wingdings" w:hAnsi="Wingdings" w:hint="default"/>
+        <w:sz w:val="20"/>
+      </w:rPr>
+    </w:lvl>
+    <w:lvl w:ilvl="4" w:tentative="1">
+      <w:start w:val="1"/>
+      <w:numFmt w:val="bullet"/>
+      <w:lvlText w:val=""/>
+      <w:lvlJc w:val="left"/>
+      <w:pPr>
+        <w:tabs>
+          <w:tab w:val="num" w:pos="3600"/>
+        </w:tabs>
+        <w:ind w:left="3600" w:hanging="360"/>
+      </w:pPr>
+      <w:rPr>
+        <w:rFonts w:ascii="Wingdings" w:hAnsi="Wingdings" w:hint="default"/>
+        <w:sz w:val="20"/>
+      </w:rPr>
+    </w:lvl>
+    <w:lvl w:ilvl="5" w:tentative="1">
+      <w:start w:val="1"/>
+      <w:numFmt w:val="bullet"/>
+      <w:lvlText w:val=""/>
+      <w:lvlJc w:val="left"/>
+      <w:pPr>
+        <w:tabs>
+          <w:tab w:val="num" w:pos="4320"/>
+        </w:tabs>
+        <w:ind w:left="4320" w:hanging="360"/>
+      </w:pPr>
+      <w:rPr>
+        <w:rFonts w:ascii="Wingdings" w:hAnsi="Wingdings" w:hint="default"/>
+        <w:sz w:val="20"/>
+      </w:rPr>
+    </w:lvl>
+    <w:lvl w:ilvl="6" w:tentative="1">
+      <w:start w:val="1"/>
+      <w:numFmt w:val="bullet"/>
+      <w:lvlText w:val=""/>
+      <w:lvlJc w:val="left"/>
+      <w:pPr>
+        <w:tabs>
+          <w:tab w:val="num" w:pos="5040"/>
+        </w:tabs>
+        <w:ind w:left="5040" w:hanging="360"/>
+      </w:pPr>
+      <w:rPr>
+        <w:rFonts w:ascii="Wingdings" w:hAnsi="Wingdings" w:hint="default"/>
+        <w:sz w:val="20"/>
+      </w:rPr>
+    </w:lvl>
+    <w:lvl w:ilvl="7" w:tentative="1">
+      <w:start w:val="1"/>
+      <w:numFmt w:val="bullet"/>
+      <w:lvlText w:val=""/>
+      <w:lvlJc w:val="left"/>
+      <w:pPr>
+        <w:tabs>
+          <w:tab w:val="num" w:pos="5760"/>
+        </w:tabs>
+        <w:ind w:left="5760" w:hanging="360"/>
+      </w:pPr>
+      <w:rPr>
+        <w:rFonts w:ascii="Wingdings" w:hAnsi="Wingdings" w:hint="default"/>
+        <w:sz w:val="20"/>
+      </w:rPr>
+    </w:lvl>
+    <w:lvl w:ilvl="8" w:tentative="1">
+      <w:start w:val="1"/>
+      <w:numFmt w:val="bullet"/>
+      <w:lvlText w:val=""/>
+      <w:lvlJc w:val="left"/>
+      <w:pPr>
+        <w:tabs>
+          <w:tab w:val="num" w:pos="6480"/>
+        </w:tabs>
+        <w:ind w:left="6480" w:hanging="360"/>
+      </w:pPr>
+      <w:rPr>
+        <w:rFonts w:ascii="Wingdings" w:hAnsi="Wingdings" w:hint="default"/>
+        <w:sz w:val="20"/>
+      </w:rPr>
+    </w:lvl>
+  </w:abstractNum>
+  <w:abstractNum w:abstractNumId="23" w15:restartNumberingAfterBreak="0">
     <w:nsid w:val="704C6605"/>
     <w:multiLevelType w:val="multilevel"/>
     <w:tmpl w:val="133A01DC"/>
@@ -3434,7 +6654,156 @@
       </w:pPr>
     </w:lvl>
   </w:abstractNum>
-  <w:abstractNum w:abstractNumId="13" w15:restartNumberingAfterBreak="0">
+  <w:abstractNum w:abstractNumId="24" w15:restartNumberingAfterBreak="0">
+    <w:nsid w:val="7F2D2F4C"/>
+    <w:multiLevelType w:val="multilevel"/>
+    <w:tmpl w:val="62E44E80"/>
+    <w:lvl w:ilvl="0">
+      <w:start w:val="1"/>
+      <w:numFmt w:val="bullet"/>
+      <w:lvlText w:val=""/>
+      <w:lvlJc w:val="left"/>
+      <w:pPr>
+        <w:tabs>
+          <w:tab w:val="num" w:pos="720"/>
+        </w:tabs>
+        <w:ind w:left="720" w:hanging="360"/>
+      </w:pPr>
+      <w:rPr>
+        <w:rFonts w:ascii="Symbol" w:hAnsi="Symbol" w:hint="default"/>
+        <w:sz w:val="20"/>
+      </w:rPr>
+    </w:lvl>
+    <w:lvl w:ilvl="1">
+      <w:start w:val="1"/>
+      <w:numFmt w:val="bullet"/>
+      <w:lvlText w:val="o"/>
+      <w:lvlJc w:val="left"/>
+      <w:pPr>
+        <w:tabs>
+          <w:tab w:val="num" w:pos="1440"/>
+        </w:tabs>
+        <w:ind w:left="1440" w:hanging="360"/>
+      </w:pPr>
+      <w:rPr>
+        <w:rFonts w:ascii="Courier New" w:hAnsi="Courier New" w:hint="default"/>
+        <w:sz w:val="20"/>
+      </w:rPr>
+    </w:lvl>
+    <w:lvl w:ilvl="2" w:tentative="1">
+      <w:start w:val="1"/>
+      <w:numFmt w:val="bullet"/>
+      <w:lvlText w:val=""/>
+      <w:lvlJc w:val="left"/>
+      <w:pPr>
+        <w:tabs>
+          <w:tab w:val="num" w:pos="2160"/>
+        </w:tabs>
+        <w:ind w:left="2160" w:hanging="360"/>
+      </w:pPr>
+      <w:rPr>
+        <w:rFonts w:ascii="Wingdings" w:hAnsi="Wingdings" w:hint="default"/>
+        <w:sz w:val="20"/>
+      </w:rPr>
+    </w:lvl>
+    <w:lvl w:ilvl="3" w:tentative="1">
+      <w:start w:val="1"/>
+      <w:numFmt w:val="bullet"/>
+      <w:lvlText w:val=""/>
+      <w:lvlJc w:val="left"/>
+      <w:pPr>
+        <w:tabs>
+          <w:tab w:val="num" w:pos="2880"/>
+        </w:tabs>
+        <w:ind w:left="2880" w:hanging="360"/>
+      </w:pPr>
+      <w:rPr>
+        <w:rFonts w:ascii="Wingdings" w:hAnsi="Wingdings" w:hint="default"/>
+        <w:sz w:val="20"/>
+      </w:rPr>
+    </w:lvl>
+    <w:lvl w:ilvl="4" w:tentative="1">
+      <w:start w:val="1"/>
+      <w:numFmt w:val="bullet"/>
+      <w:lvlText w:val=""/>
+      <w:lvlJc w:val="left"/>
+      <w:pPr>
+        <w:tabs>
+          <w:tab w:val="num" w:pos="3600"/>
+        </w:tabs>
+        <w:ind w:left="3600" w:hanging="360"/>
+      </w:pPr>
+      <w:rPr>
+        <w:rFonts w:ascii="Wingdings" w:hAnsi="Wingdings" w:hint="default"/>
+        <w:sz w:val="20"/>
+      </w:rPr>
+    </w:lvl>
+    <w:lvl w:ilvl="5" w:tentative="1">
+      <w:start w:val="1"/>
+      <w:numFmt w:val="bullet"/>
+      <w:lvlText w:val=""/>
+      <w:lvlJc w:val="left"/>
+      <w:pPr>
+        <w:tabs>
+          <w:tab w:val="num" w:pos="4320"/>
+        </w:tabs>
+        <w:ind w:left="4320" w:hanging="360"/>
+      </w:pPr>
+      <w:rPr>
+        <w:rFonts w:ascii="Wingdings" w:hAnsi="Wingdings" w:hint="default"/>
+        <w:sz w:val="20"/>
+      </w:rPr>
+    </w:lvl>
+    <w:lvl w:ilvl="6" w:tentative="1">
+      <w:start w:val="1"/>
+      <w:numFmt w:val="bullet"/>
+      <w:lvlText w:val=""/>
+      <w:lvlJc w:val="left"/>
+      <w:pPr>
+        <w:tabs>
+          <w:tab w:val="num" w:pos="5040"/>
+        </w:tabs>
+        <w:ind w:left="5040" w:hanging="360"/>
+      </w:pPr>
+      <w:rPr>
+        <w:rFonts w:ascii="Wingdings" w:hAnsi="Wingdings" w:hint="default"/>
+        <w:sz w:val="20"/>
+      </w:rPr>
+    </w:lvl>
+    <w:lvl w:ilvl="7" w:tentative="1">
+      <w:start w:val="1"/>
+      <w:numFmt w:val="bullet"/>
+      <w:lvlText w:val=""/>
+      <w:lvlJc w:val="left"/>
+      <w:pPr>
+        <w:tabs>
+          <w:tab w:val="num" w:pos="5760"/>
+        </w:tabs>
+        <w:ind w:left="5760" w:hanging="360"/>
+      </w:pPr>
+      <w:rPr>
+        <w:rFonts w:ascii="Wingdings" w:hAnsi="Wingdings" w:hint="default"/>
+        <w:sz w:val="20"/>
+      </w:rPr>
+    </w:lvl>
+    <w:lvl w:ilvl="8" w:tentative="1">
+      <w:start w:val="1"/>
+      <w:numFmt w:val="bullet"/>
+      <w:lvlText w:val=""/>
+      <w:lvlJc w:val="left"/>
+      <w:pPr>
+        <w:tabs>
+          <w:tab w:val="num" w:pos="6480"/>
+        </w:tabs>
+        <w:ind w:left="6480" w:hanging="360"/>
+      </w:pPr>
+      <w:rPr>
+        <w:rFonts w:ascii="Wingdings" w:hAnsi="Wingdings" w:hint="default"/>
+        <w:sz w:val="20"/>
+      </w:rPr>
+    </w:lvl>
+  </w:abstractNum>
+  <w:abstractNum w:abstractNumId="25" w15:restartNumberingAfterBreak="0">
     <w:nsid w:val="7FD26017"/>
     <w:multiLevelType w:val="multilevel"/>
     <w:tmpl w:val="1F2C2ECE"/>
@@ -3584,46 +6953,82 @@
     </w:lvl>
   </w:abstractNum>
   <w:num w:numId="1" w16cid:durableId="549878088">
+    <w:abstractNumId w:val="13"/>
+  </w:num>
+  <w:num w:numId="2" w16cid:durableId="271475291">
+    <w:abstractNumId w:val="2"/>
+  </w:num>
+  <w:num w:numId="3" w16cid:durableId="28070648">
+    <w:abstractNumId w:val="25"/>
+  </w:num>
+  <w:num w:numId="4" w16cid:durableId="1866867671">
+    <w:abstractNumId w:val="18"/>
+  </w:num>
+  <w:num w:numId="5" w16cid:durableId="1736317079">
+    <w:abstractNumId w:val="12"/>
+  </w:num>
+  <w:num w:numId="6" w16cid:durableId="267780878">
+    <w:abstractNumId w:val="1"/>
+  </w:num>
+  <w:num w:numId="7" w16cid:durableId="1765564958">
+    <w:abstractNumId w:val="23"/>
+  </w:num>
+  <w:num w:numId="8" w16cid:durableId="1477606099">
     <w:abstractNumId w:val="7"/>
   </w:num>
-  <w:num w:numId="2" w16cid:durableId="271475291">
-    <w:abstractNumId w:val="1"/>
+  <w:num w:numId="9" w16cid:durableId="1701782027">
+    <w:abstractNumId w:val="17"/>
   </w:num>
-  <w:num w:numId="3" w16cid:durableId="28070648">
-    <w:abstractNumId w:val="13"/>
+  <w:num w:numId="10" w16cid:durableId="815613115">
+    <w:abstractNumId w:val="16"/>
   </w:num>
-  <w:num w:numId="4" w16cid:durableId="1866867671">
+  <w:num w:numId="11" w16cid:durableId="1212620507">
+    <w:abstractNumId w:val="9"/>
+  </w:num>
+  <w:num w:numId="12" w16cid:durableId="926116159">
+    <w:abstractNumId w:val="6"/>
+  </w:num>
+  <w:num w:numId="13" w16cid:durableId="535242091">
+    <w:abstractNumId w:val="15"/>
+  </w:num>
+  <w:num w:numId="14" w16cid:durableId="155195915">
+    <w:abstractNumId w:val="3"/>
+  </w:num>
+  <w:num w:numId="15" w16cid:durableId="324481743">
     <w:abstractNumId w:val="11"/>
   </w:num>
-  <w:num w:numId="5" w16cid:durableId="1736317079">
-    <w:abstractNumId w:val="6"/>
+  <w:num w:numId="16" w16cid:durableId="510410677">
+    <w:abstractNumId w:val="22"/>
   </w:num>
-  <w:num w:numId="6" w16cid:durableId="267780878">
+  <w:num w:numId="17" w16cid:durableId="69352505">
+    <w:abstractNumId w:val="21"/>
+  </w:num>
+  <w:num w:numId="18" w16cid:durableId="1838883887">
+    <w:abstractNumId w:val="10"/>
+  </w:num>
+  <w:num w:numId="19" w16cid:durableId="652677809">
+    <w:abstractNumId w:val="19"/>
+  </w:num>
+  <w:num w:numId="20" w16cid:durableId="2131120970">
+    <w:abstractNumId w:val="14"/>
+  </w:num>
+  <w:num w:numId="21" w16cid:durableId="2085909021">
+    <w:abstractNumId w:val="24"/>
+  </w:num>
+  <w:num w:numId="22" w16cid:durableId="274100093">
     <w:abstractNumId w:val="0"/>
   </w:num>
-  <w:num w:numId="7" w16cid:durableId="1765564958">
-    <w:abstractNumId w:val="12"/>
+  <w:num w:numId="23" w16cid:durableId="1956328704">
+    <w:abstractNumId w:val="8"/>
   </w:num>
-  <w:num w:numId="8" w16cid:durableId="1477606099">
+  <w:num w:numId="24" w16cid:durableId="1788349233">
+    <w:abstractNumId w:val="5"/>
+  </w:num>
+  <w:num w:numId="25" w16cid:durableId="47533870">
     <w:abstractNumId w:val="4"/>
   </w:num>
-  <w:num w:numId="9" w16cid:durableId="1701782027">
-    <w:abstractNumId w:val="10"/>
-  </w:num>
-  <w:num w:numId="10" w16cid:durableId="815613115">
-    <w:abstractNumId w:val="9"/>
-  </w:num>
-  <w:num w:numId="11" w16cid:durableId="1212620507">
-    <w:abstractNumId w:val="5"/>
-  </w:num>
-  <w:num w:numId="12" w16cid:durableId="926116159">
-    <w:abstractNumId w:val="3"/>
-  </w:num>
-  <w:num w:numId="13" w16cid:durableId="535242091">
-    <w:abstractNumId w:val="8"/>
-  </w:num>
-  <w:num w:numId="14" w16cid:durableId="155195915">
-    <w:abstractNumId w:val="2"/>
+  <w:num w:numId="26" w16cid:durableId="962267853">
+    <w:abstractNumId w:val="20"/>
   </w:num>
 </w:numbering>
 </file>

</xml_diff>